<commit_message>
docs: publish module detail specifications
</commit_message>
<xml_diff>
--- a/operations-requirements/downloads/02_线索池 PRD.docx
+++ b/operations-requirements/downloads/02_线索池 PRD.docx
@@ -38,7 +38,7 @@
           <w:color w:val="2E74B5"/>
           <w:sz w:val="20"/>
         </w:rPr>
-        <w:t>OS-OPS-PRD-02  |  V2.3  |  2026-09-09</w:t>
+        <w:t>OS-OPS-PRD-02  |  V2.5  |  2026-09-09</w:t>
       </w:r>
     </w:p>
     <w:p>
@@ -366,7 +366,7 @@
                 <w:color w:val="1F2937"/>
                 <w:sz w:val="18"/>
               </w:rPr>
-              <w:t>V2.3  2026-09-09</w:t>
+              <w:t>V2.5  2026-09-09</w:t>
             </w:r>
           </w:p>
         </w:tc>
@@ -12027,6 +12027,4694 @@
       <w:r>
         <w:t>跟进记录保存成功但任务或机会创建失败时，页面明确显示部分成功并提供补偿入口</w:t>
       </w:r>
+    </w:p>
+    <w:p>
+      <w:pPr>
+        <w:pStyle w:val="Heading2"/>
+      </w:pPr>
+      <w:r>
+        <w:t>5.3 详情入口与页面容器</w:t>
+      </w:r>
+    </w:p>
+    <w:p>
+      <w:r>
+        <w:t>用户从列表行的查看入口、业务编号链接或关联对象深链打开详情。界面设计依据原型中的“线索池列表与筛选”真实截图；原型未提供独立详情画面时，不生成示例截图，研发按本文档定义在现有列表视觉体系中实现右侧抽屉或独立详情页。</w:t>
+      </w:r>
+    </w:p>
+    <w:tbl>
+      <w:tblPr>
+        <w:tblStyle w:val="TableGrid"/>
+        <w:tblW w:type="dxa" w:w="10224"/>
+        <w:jc w:val="center"/>
+        <w:tblLayout w:type="fixed"/>
+        <w:tblLook w:firstColumn="1" w:firstRow="1" w:lastColumn="0" w:lastRow="0" w:noHBand="0" w:noVBand="1" w:val="04A0"/>
+      </w:tblPr>
+      <w:tblGrid>
+        <w:gridCol w:w="1944"/>
+        <w:gridCol w:w="8280"/>
+      </w:tblGrid>
+      <w:tr>
+        <w:trPr>
+          <w:tblHeader/>
+        </w:trPr>
+        <w:tc>
+          <w:tcPr>
+            <w:tcW w:type="dxa" w:w="1944"/>
+            <w:shd w:fill="17365D"/>
+            <w:tcMar>
+              <w:top w:w="75" w:type="dxa"/>
+              <w:start w:w="100" w:type="dxa"/>
+              <w:bottom w:w="75" w:type="dxa"/>
+              <w:end w:w="100" w:type="dxa"/>
+            </w:tcMar>
+            <w:vAlign w:val="center"/>
+          </w:tcPr>
+          <w:p>
+            <w:r>
+              <w:rPr>
+                <w:rFonts w:ascii="Calibri" w:hAnsi="Calibri" w:eastAsia="Microsoft YaHei"/>
+                <w:b/>
+                <w:color w:val="FFFFFF"/>
+                <w:sz w:val="16"/>
+              </w:rPr>
+              <w:t>界面状态</w:t>
+            </w:r>
+          </w:p>
+        </w:tc>
+        <w:tc>
+          <w:tcPr>
+            <w:tcW w:type="dxa" w:w="8280"/>
+            <w:shd w:fill="17365D"/>
+            <w:tcMar>
+              <w:top w:w="75" w:type="dxa"/>
+              <w:start w:w="100" w:type="dxa"/>
+              <w:bottom w:w="75" w:type="dxa"/>
+              <w:end w:w="100" w:type="dxa"/>
+            </w:tcMar>
+            <w:vAlign w:val="center"/>
+          </w:tcPr>
+          <w:p>
+            <w:r>
+              <w:rPr>
+                <w:rFonts w:ascii="Calibri" w:hAnsi="Calibri" w:eastAsia="Microsoft YaHei"/>
+                <w:b/>
+                <w:color w:val="FFFFFF"/>
+                <w:sz w:val="16"/>
+              </w:rPr>
+              <w:t>完整处理规则</w:t>
+            </w:r>
+          </w:p>
+        </w:tc>
+      </w:tr>
+      <w:tr>
+        <w:trPr>
+          <w:cantSplit/>
+        </w:trPr>
+        <w:tc>
+          <w:tcPr>
+            <w:tcW w:type="dxa" w:w="1944"/>
+            <w:tcMar>
+              <w:top w:w="75" w:type="dxa"/>
+              <w:start w:w="100" w:type="dxa"/>
+              <w:bottom w:w="75" w:type="dxa"/>
+              <w:end w:w="100" w:type="dxa"/>
+            </w:tcMar>
+            <w:vAlign w:val="center"/>
+          </w:tcPr>
+          <w:p>
+            <w:pPr>
+              <w:spacing w:after="0" w:line="259" w:lineRule="auto"/>
+            </w:pPr>
+            <w:r>
+              <w:rPr>
+                <w:rFonts w:ascii="Calibri" w:hAnsi="Calibri" w:eastAsia="Microsoft YaHei"/>
+                <w:b w:val="0"/>
+                <w:color w:val="1F2937"/>
+                <w:sz w:val="16"/>
+              </w:rPr>
+              <w:t>打开与返回</w:t>
+            </w:r>
+          </w:p>
+        </w:tc>
+        <w:tc>
+          <w:tcPr>
+            <w:tcW w:type="dxa" w:w="8280"/>
+            <w:tcMar>
+              <w:top w:w="75" w:type="dxa"/>
+              <w:start w:w="100" w:type="dxa"/>
+              <w:bottom w:w="75" w:type="dxa"/>
+              <w:end w:w="100" w:type="dxa"/>
+            </w:tcMar>
+            <w:vAlign w:val="center"/>
+          </w:tcPr>
+          <w:p>
+            <w:pPr>
+              <w:spacing w:after="0" w:line="259" w:lineRule="auto"/>
+            </w:pPr>
+            <w:r>
+              <w:rPr>
+                <w:rFonts w:ascii="Calibri" w:hAnsi="Calibri" w:eastAsia="Microsoft YaHei"/>
+                <w:b w:val="0"/>
+                <w:color w:val="1F2937"/>
+                <w:sz w:val="16"/>
+              </w:rPr>
+              <w:t>打开时保存列表筛选、分页、排序和滚动位置；关闭或返回后恢复原上下文，并只刷新发生变化的行。</w:t>
+            </w:r>
+          </w:p>
+        </w:tc>
+      </w:tr>
+      <w:tr>
+        <w:trPr>
+          <w:cantSplit/>
+        </w:trPr>
+        <w:tc>
+          <w:tcPr>
+            <w:tcW w:type="dxa" w:w="1944"/>
+            <w:tcMar>
+              <w:top w:w="75" w:type="dxa"/>
+              <w:start w:w="100" w:type="dxa"/>
+              <w:bottom w:w="75" w:type="dxa"/>
+              <w:end w:w="100" w:type="dxa"/>
+            </w:tcMar>
+            <w:vAlign w:val="center"/>
+            <w:shd w:fill="F4F7FB"/>
+          </w:tcPr>
+          <w:p>
+            <w:pPr>
+              <w:spacing w:after="0" w:line="259" w:lineRule="auto"/>
+            </w:pPr>
+            <w:r>
+              <w:rPr>
+                <w:rFonts w:ascii="Calibri" w:hAnsi="Calibri" w:eastAsia="Microsoft YaHei"/>
+                <w:b w:val="0"/>
+                <w:color w:val="1F2937"/>
+                <w:sz w:val="16"/>
+              </w:rPr>
+              <w:t>加载中</w:t>
+            </w:r>
+          </w:p>
+        </w:tc>
+        <w:tc>
+          <w:tcPr>
+            <w:tcW w:type="dxa" w:w="8280"/>
+            <w:tcMar>
+              <w:top w:w="75" w:type="dxa"/>
+              <w:start w:w="100" w:type="dxa"/>
+              <w:bottom w:w="75" w:type="dxa"/>
+              <w:end w:w="100" w:type="dxa"/>
+            </w:tcMar>
+            <w:vAlign w:val="center"/>
+            <w:shd w:fill="F4F7FB"/>
+          </w:tcPr>
+          <w:p>
+            <w:pPr>
+              <w:spacing w:after="0" w:line="259" w:lineRule="auto"/>
+            </w:pPr>
+            <w:r>
+              <w:rPr>
+                <w:rFonts w:ascii="Calibri" w:hAnsi="Calibri" w:eastAsia="Microsoft YaHei"/>
+                <w:b w:val="0"/>
+                <w:color w:val="1F2937"/>
+                <w:sz w:val="16"/>
+              </w:rPr>
+              <w:t>先展示对象类型、业务编号和骨架屏；各信息组独立加载，禁止闪现上一条记录。</w:t>
+            </w:r>
+          </w:p>
+        </w:tc>
+      </w:tr>
+      <w:tr>
+        <w:trPr>
+          <w:cantSplit/>
+        </w:trPr>
+        <w:tc>
+          <w:tcPr>
+            <w:tcW w:type="dxa" w:w="1944"/>
+            <w:tcMar>
+              <w:top w:w="75" w:type="dxa"/>
+              <w:start w:w="100" w:type="dxa"/>
+              <w:bottom w:w="75" w:type="dxa"/>
+              <w:end w:w="100" w:type="dxa"/>
+            </w:tcMar>
+            <w:vAlign w:val="center"/>
+          </w:tcPr>
+          <w:p>
+            <w:pPr>
+              <w:spacing w:after="0" w:line="259" w:lineRule="auto"/>
+            </w:pPr>
+            <w:r>
+              <w:rPr>
+                <w:rFonts w:ascii="Calibri" w:hAnsi="Calibri" w:eastAsia="Microsoft YaHei"/>
+                <w:b w:val="0"/>
+                <w:color w:val="1F2937"/>
+                <w:sz w:val="16"/>
+              </w:rPr>
+              <w:t>加载成功</w:t>
+            </w:r>
+          </w:p>
+        </w:tc>
+        <w:tc>
+          <w:tcPr>
+            <w:tcW w:type="dxa" w:w="8280"/>
+            <w:tcMar>
+              <w:top w:w="75" w:type="dxa"/>
+              <w:start w:w="100" w:type="dxa"/>
+              <w:bottom w:w="75" w:type="dxa"/>
+              <w:end w:w="100" w:type="dxa"/>
+            </w:tcMar>
+            <w:vAlign w:val="center"/>
+          </w:tcPr>
+          <w:p>
+            <w:pPr>
+              <w:spacing w:after="0" w:line="259" w:lineRule="auto"/>
+            </w:pPr>
+            <w:r>
+              <w:rPr>
+                <w:rFonts w:ascii="Calibri" w:hAnsi="Calibri" w:eastAsia="Microsoft YaHei"/>
+                <w:b w:val="0"/>
+                <w:color w:val="1F2937"/>
+                <w:sz w:val="16"/>
+              </w:rPr>
+              <w:t>返回id、业务编号、version、当前状态、asOfTime、fieldPermissions和allowedActions；页面以响应为唯一展示依据。</w:t>
+            </w:r>
+          </w:p>
+        </w:tc>
+      </w:tr>
+      <w:tr>
+        <w:trPr>
+          <w:cantSplit/>
+        </w:trPr>
+        <w:tc>
+          <w:tcPr>
+            <w:tcW w:type="dxa" w:w="1944"/>
+            <w:tcMar>
+              <w:top w:w="75" w:type="dxa"/>
+              <w:start w:w="100" w:type="dxa"/>
+              <w:bottom w:w="75" w:type="dxa"/>
+              <w:end w:w="100" w:type="dxa"/>
+            </w:tcMar>
+            <w:vAlign w:val="center"/>
+            <w:shd w:fill="F4F7FB"/>
+          </w:tcPr>
+          <w:p>
+            <w:pPr>
+              <w:spacing w:after="0" w:line="259" w:lineRule="auto"/>
+            </w:pPr>
+            <w:r>
+              <w:rPr>
+                <w:rFonts w:ascii="Calibri" w:hAnsi="Calibri" w:eastAsia="Microsoft YaHei"/>
+                <w:b w:val="0"/>
+                <w:color w:val="1F2937"/>
+                <w:sz w:val="16"/>
+              </w:rPr>
+              <w:t>记录不存在</w:t>
+            </w:r>
+          </w:p>
+        </w:tc>
+        <w:tc>
+          <w:tcPr>
+            <w:tcW w:type="dxa" w:w="8280"/>
+            <w:tcMar>
+              <w:top w:w="75" w:type="dxa"/>
+              <w:start w:w="100" w:type="dxa"/>
+              <w:bottom w:w="75" w:type="dxa"/>
+              <w:end w:w="100" w:type="dxa"/>
+            </w:tcMar>
+            <w:vAlign w:val="center"/>
+            <w:shd w:fill="F4F7FB"/>
+          </w:tcPr>
+          <w:p>
+            <w:pPr>
+              <w:spacing w:after="0" w:line="259" w:lineRule="auto"/>
+            </w:pPr>
+            <w:r>
+              <w:rPr>
+                <w:rFonts w:ascii="Calibri" w:hAnsi="Calibri" w:eastAsia="Microsoft YaHei"/>
+                <w:b w:val="0"/>
+                <w:color w:val="1F2937"/>
+                <w:sz w:val="16"/>
+              </w:rPr>
+              <w:t>显示记录不存在、已归档或已移除；不泄露客户、金额、地址和关联对象，提供返回列表入口。</w:t>
+            </w:r>
+          </w:p>
+        </w:tc>
+      </w:tr>
+      <w:tr>
+        <w:trPr>
+          <w:cantSplit/>
+        </w:trPr>
+        <w:tc>
+          <w:tcPr>
+            <w:tcW w:type="dxa" w:w="1944"/>
+            <w:tcMar>
+              <w:top w:w="75" w:type="dxa"/>
+              <w:start w:w="100" w:type="dxa"/>
+              <w:bottom w:w="75" w:type="dxa"/>
+              <w:end w:w="100" w:type="dxa"/>
+            </w:tcMar>
+            <w:vAlign w:val="center"/>
+          </w:tcPr>
+          <w:p>
+            <w:pPr>
+              <w:spacing w:after="0" w:line="259" w:lineRule="auto"/>
+            </w:pPr>
+            <w:r>
+              <w:rPr>
+                <w:rFonts w:ascii="Calibri" w:hAnsi="Calibri" w:eastAsia="Microsoft YaHei"/>
+                <w:b w:val="0"/>
+                <w:color w:val="1F2937"/>
+                <w:sz w:val="16"/>
+              </w:rPr>
+              <w:t>无权限</w:t>
+            </w:r>
+          </w:p>
+        </w:tc>
+        <w:tc>
+          <w:tcPr>
+            <w:tcW w:type="dxa" w:w="8280"/>
+            <w:tcMar>
+              <w:top w:w="75" w:type="dxa"/>
+              <w:start w:w="100" w:type="dxa"/>
+              <w:bottom w:w="75" w:type="dxa"/>
+              <w:end w:w="100" w:type="dxa"/>
+            </w:tcMar>
+            <w:vAlign w:val="center"/>
+          </w:tcPr>
+          <w:p>
+            <w:pPr>
+              <w:spacing w:after="0" w:line="259" w:lineRule="auto"/>
+            </w:pPr>
+            <w:r>
+              <w:rPr>
+                <w:rFonts w:ascii="Calibri" w:hAnsi="Calibri" w:eastAsia="Microsoft YaHei"/>
+                <w:b w:val="0"/>
+                <w:color w:val="1F2937"/>
+                <w:sz w:val="16"/>
+              </w:rPr>
+              <w:t>详情接口在返回任何业务字段前完成对象级和字段级鉴权；页面显示无权查看并记录拒绝审计。</w:t>
+            </w:r>
+          </w:p>
+        </w:tc>
+      </w:tr>
+      <w:tr>
+        <w:trPr>
+          <w:cantSplit/>
+        </w:trPr>
+        <w:tc>
+          <w:tcPr>
+            <w:tcW w:type="dxa" w:w="1944"/>
+            <w:tcMar>
+              <w:top w:w="75" w:type="dxa"/>
+              <w:start w:w="100" w:type="dxa"/>
+              <w:bottom w:w="75" w:type="dxa"/>
+              <w:end w:w="100" w:type="dxa"/>
+            </w:tcMar>
+            <w:vAlign w:val="center"/>
+            <w:shd w:fill="F4F7FB"/>
+          </w:tcPr>
+          <w:p>
+            <w:pPr>
+              <w:spacing w:after="0" w:line="259" w:lineRule="auto"/>
+            </w:pPr>
+            <w:r>
+              <w:rPr>
+                <w:rFonts w:ascii="Calibri" w:hAnsi="Calibri" w:eastAsia="Microsoft YaHei"/>
+                <w:b w:val="0"/>
+                <w:color w:val="1F2937"/>
+                <w:sz w:val="16"/>
+              </w:rPr>
+              <w:t>版本变化</w:t>
+            </w:r>
+          </w:p>
+        </w:tc>
+        <w:tc>
+          <w:tcPr>
+            <w:tcW w:type="dxa" w:w="8280"/>
+            <w:tcMar>
+              <w:top w:w="75" w:type="dxa"/>
+              <w:start w:w="100" w:type="dxa"/>
+              <w:bottom w:w="75" w:type="dxa"/>
+              <w:end w:w="100" w:type="dxa"/>
+            </w:tcMar>
+            <w:vAlign w:val="center"/>
+            <w:shd w:fill="F4F7FB"/>
+          </w:tcPr>
+          <w:p>
+            <w:pPr>
+              <w:spacing w:after="0" w:line="259" w:lineRule="auto"/>
+            </w:pPr>
+            <w:r>
+              <w:rPr>
+                <w:rFonts w:ascii="Calibri" w:hAnsi="Calibri" w:eastAsia="Microsoft YaHei"/>
+                <w:b w:val="0"/>
+                <w:color w:val="1F2937"/>
+                <w:sz w:val="16"/>
+              </w:rPr>
+              <w:t>收到对象变更事件时自动刷新只读区；若存在未提交操作，提示比较最新版本，不覆盖用户输入。</w:t>
+            </w:r>
+          </w:p>
+        </w:tc>
+      </w:tr>
+      <w:tr>
+        <w:trPr>
+          <w:cantSplit/>
+        </w:trPr>
+        <w:tc>
+          <w:tcPr>
+            <w:tcW w:type="dxa" w:w="1944"/>
+            <w:tcMar>
+              <w:top w:w="75" w:type="dxa"/>
+              <w:start w:w="100" w:type="dxa"/>
+              <w:bottom w:w="75" w:type="dxa"/>
+              <w:end w:w="100" w:type="dxa"/>
+            </w:tcMar>
+            <w:vAlign w:val="center"/>
+          </w:tcPr>
+          <w:p>
+            <w:pPr>
+              <w:spacing w:after="0" w:line="259" w:lineRule="auto"/>
+            </w:pPr>
+            <w:r>
+              <w:rPr>
+                <w:rFonts w:ascii="Calibri" w:hAnsi="Calibri" w:eastAsia="Microsoft YaHei"/>
+                <w:b w:val="0"/>
+                <w:color w:val="1F2937"/>
+                <w:sz w:val="16"/>
+              </w:rPr>
+              <w:t>部分失败</w:t>
+            </w:r>
+          </w:p>
+        </w:tc>
+        <w:tc>
+          <w:tcPr>
+            <w:tcW w:type="dxa" w:w="8280"/>
+            <w:tcMar>
+              <w:top w:w="75" w:type="dxa"/>
+              <w:start w:w="100" w:type="dxa"/>
+              <w:bottom w:w="75" w:type="dxa"/>
+              <w:end w:w="100" w:type="dxa"/>
+            </w:tcMar>
+            <w:vAlign w:val="center"/>
+          </w:tcPr>
+          <w:p>
+            <w:pPr>
+              <w:spacing w:after="0" w:line="259" w:lineRule="auto"/>
+            </w:pPr>
+            <w:r>
+              <w:rPr>
+                <w:rFonts w:ascii="Calibri" w:hAnsi="Calibri" w:eastAsia="Microsoft YaHei"/>
+                <w:b w:val="0"/>
+                <w:color w:val="1F2937"/>
+                <w:sz w:val="16"/>
+              </w:rPr>
+              <w:t>基本资料可显示时保留页面，仅在失败的信息组显示错误、traceId和重试；不得把缺失值显示为0或正常状态。</w:t>
+            </w:r>
+          </w:p>
+        </w:tc>
+      </w:tr>
+    </w:tbl>
+    <w:p>
+      <w:pPr>
+        <w:spacing w:after="0"/>
+      </w:pPr>
+    </w:p>
+    <w:p>
+      <w:pPr>
+        <w:pStyle w:val="Heading2"/>
+      </w:pPr>
+      <w:r>
+        <w:t>5.4 顶部摘要与详情信息组</w:t>
+      </w:r>
+    </w:p>
+    <w:p>
+      <w:r>
+        <w:t>顶部摘要用于确认当前查看对象、归属、状态、责任人和关键业务值。详情字段必须覆盖新增、编辑及系统处理后形成的有效数据，不得只复制列表列。</w:t>
+      </w:r>
+    </w:p>
+    <w:tbl>
+      <w:tblPr>
+        <w:tblStyle w:val="TableGrid"/>
+        <w:tblW w:type="dxa" w:w="10224"/>
+        <w:jc w:val="center"/>
+        <w:tblLayout w:type="fixed"/>
+        <w:tblLook w:firstColumn="1" w:firstRow="1" w:lastColumn="0" w:lastRow="0" w:noHBand="0" w:noVBand="1" w:val="04A0"/>
+      </w:tblPr>
+      <w:tblGrid>
+        <w:gridCol w:w="2088"/>
+        <w:gridCol w:w="4968"/>
+        <w:gridCol w:w="3168"/>
+      </w:tblGrid>
+      <w:tr>
+        <w:trPr>
+          <w:tblHeader/>
+        </w:trPr>
+        <w:tc>
+          <w:tcPr>
+            <w:tcW w:type="dxa" w:w="2088"/>
+            <w:shd w:fill="17365D"/>
+            <w:tcMar>
+              <w:top w:w="75" w:type="dxa"/>
+              <w:start w:w="100" w:type="dxa"/>
+              <w:bottom w:w="75" w:type="dxa"/>
+              <w:end w:w="100" w:type="dxa"/>
+            </w:tcMar>
+            <w:vAlign w:val="center"/>
+          </w:tcPr>
+          <w:p>
+            <w:r>
+              <w:rPr>
+                <w:rFonts w:ascii="Calibri" w:hAnsi="Calibri" w:eastAsia="Microsoft YaHei"/>
+                <w:b/>
+                <w:color w:val="FFFFFF"/>
+                <w:sz w:val="15"/>
+              </w:rPr>
+              <w:t>信息组</w:t>
+            </w:r>
+          </w:p>
+        </w:tc>
+        <w:tc>
+          <w:tcPr>
+            <w:tcW w:type="dxa" w:w="4968"/>
+            <w:shd w:fill="17365D"/>
+            <w:tcMar>
+              <w:top w:w="75" w:type="dxa"/>
+              <w:start w:w="100" w:type="dxa"/>
+              <w:bottom w:w="75" w:type="dxa"/>
+              <w:end w:w="100" w:type="dxa"/>
+            </w:tcMar>
+            <w:vAlign w:val="center"/>
+          </w:tcPr>
+          <w:p>
+            <w:r>
+              <w:rPr>
+                <w:rFonts w:ascii="Calibri" w:hAnsi="Calibri" w:eastAsia="Microsoft YaHei"/>
+                <w:b/>
+                <w:color w:val="FFFFFF"/>
+                <w:sz w:val="15"/>
+              </w:rPr>
+              <w:t>展示字段</w:t>
+            </w:r>
+          </w:p>
+        </w:tc>
+        <w:tc>
+          <w:tcPr>
+            <w:tcW w:type="dxa" w:w="3168"/>
+            <w:shd w:fill="17365D"/>
+            <w:tcMar>
+              <w:top w:w="75" w:type="dxa"/>
+              <w:start w:w="100" w:type="dxa"/>
+              <w:bottom w:w="75" w:type="dxa"/>
+              <w:end w:w="100" w:type="dxa"/>
+            </w:tcMar>
+            <w:vAlign w:val="center"/>
+          </w:tcPr>
+          <w:p>
+            <w:r>
+              <w:rPr>
+                <w:rFonts w:ascii="Calibri" w:hAnsi="Calibri" w:eastAsia="Microsoft YaHei"/>
+                <w:b/>
+                <w:color w:val="FFFFFF"/>
+                <w:sz w:val="15"/>
+              </w:rPr>
+              <w:t>展示与交互规则</w:t>
+            </w:r>
+          </w:p>
+        </w:tc>
+      </w:tr>
+      <w:tr>
+        <w:trPr>
+          <w:cantSplit/>
+        </w:trPr>
+        <w:tc>
+          <w:tcPr>
+            <w:tcW w:type="dxa" w:w="2088"/>
+            <w:tcMar>
+              <w:top w:w="75" w:type="dxa"/>
+              <w:start w:w="100" w:type="dxa"/>
+              <w:bottom w:w="75" w:type="dxa"/>
+              <w:end w:w="100" w:type="dxa"/>
+            </w:tcMar>
+            <w:vAlign w:val="center"/>
+          </w:tcPr>
+          <w:p>
+            <w:pPr>
+              <w:spacing w:after="0" w:line="259" w:lineRule="auto"/>
+            </w:pPr>
+            <w:r>
+              <w:rPr>
+                <w:rFonts w:ascii="Calibri" w:hAnsi="Calibri" w:eastAsia="Microsoft YaHei"/>
+                <w:b w:val="0"/>
+                <w:color w:val="1F2937"/>
+                <w:sz w:val="15"/>
+              </w:rPr>
+              <w:t>标识与基本资料</w:t>
+            </w:r>
+          </w:p>
+        </w:tc>
+        <w:tc>
+          <w:tcPr>
+            <w:tcW w:type="dxa" w:w="4968"/>
+            <w:tcMar>
+              <w:top w:w="75" w:type="dxa"/>
+              <w:start w:w="100" w:type="dxa"/>
+              <w:bottom w:w="75" w:type="dxa"/>
+              <w:end w:w="100" w:type="dxa"/>
+            </w:tcMar>
+            <w:vAlign w:val="center"/>
+          </w:tcPr>
+          <w:p>
+            <w:pPr>
+              <w:spacing w:after="0" w:line="259" w:lineRule="auto"/>
+            </w:pPr>
+            <w:r>
+              <w:rPr>
+                <w:rFonts w:ascii="Calibri" w:hAnsi="Calibri" w:eastAsia="Microsoft YaHei"/>
+                <w:b w:val="0"/>
+                <w:color w:val="1F2937"/>
+                <w:sz w:val="15"/>
+              </w:rPr>
+              <w:t>会话 ID、需求、意向、下一步任务、标题、中文名、英文名、网上称呼、指定的使用者、区号、流动电话、电子邮件、其他电话、HKID、BR No.、地区、分区、邮递区号、公司地区、公司分区、公司邮递区号、查询地区、其他地区、工业、要求</w:t>
+            </w:r>
+          </w:p>
+        </w:tc>
+        <w:tc>
+          <w:tcPr>
+            <w:tcW w:type="dxa" w:w="3168"/>
+            <w:tcMar>
+              <w:top w:w="75" w:type="dxa"/>
+              <w:start w:w="100" w:type="dxa"/>
+              <w:bottom w:w="75" w:type="dxa"/>
+              <w:end w:w="100" w:type="dxa"/>
+            </w:tcMar>
+            <w:vAlign w:val="center"/>
+          </w:tcPr>
+          <w:p>
+            <w:pPr>
+              <w:spacing w:after="0" w:line="259" w:lineRule="auto"/>
+            </w:pPr>
+            <w:r>
+              <w:rPr>
+                <w:rFonts w:ascii="Calibri" w:hAnsi="Calibri" w:eastAsia="Microsoft YaHei"/>
+                <w:b w:val="0"/>
+                <w:color w:val="1F2937"/>
+                <w:sz w:val="15"/>
+              </w:rPr>
+              <w:t>完整显示业务编号与主属性；编号支持复制且不可编辑，敏感字段按字段权限脱敏。</w:t>
+            </w:r>
+          </w:p>
+        </w:tc>
+      </w:tr>
+      <w:tr>
+        <w:trPr>
+          <w:cantSplit/>
+        </w:trPr>
+        <w:tc>
+          <w:tcPr>
+            <w:tcW w:type="dxa" w:w="2088"/>
+            <w:tcMar>
+              <w:top w:w="75" w:type="dxa"/>
+              <w:start w:w="100" w:type="dxa"/>
+              <w:bottom w:w="75" w:type="dxa"/>
+              <w:end w:w="100" w:type="dxa"/>
+            </w:tcMar>
+            <w:vAlign w:val="center"/>
+            <w:shd w:fill="F4F7FB"/>
+          </w:tcPr>
+          <w:p>
+            <w:pPr>
+              <w:spacing w:after="0" w:line="259" w:lineRule="auto"/>
+            </w:pPr>
+            <w:r>
+              <w:rPr>
+                <w:rFonts w:ascii="Calibri" w:hAnsi="Calibri" w:eastAsia="Microsoft YaHei"/>
+                <w:b w:val="0"/>
+                <w:color w:val="1F2937"/>
+                <w:sz w:val="15"/>
+              </w:rPr>
+              <w:t>归属与关联对象</w:t>
+            </w:r>
+          </w:p>
+        </w:tc>
+        <w:tc>
+          <w:tcPr>
+            <w:tcW w:type="dxa" w:w="4968"/>
+            <w:tcMar>
+              <w:top w:w="75" w:type="dxa"/>
+              <w:start w:w="100" w:type="dxa"/>
+              <w:bottom w:w="75" w:type="dxa"/>
+              <w:end w:w="100" w:type="dxa"/>
+            </w:tcMar>
+            <w:vAlign w:val="center"/>
+            <w:shd w:fill="F4F7FB"/>
+          </w:tcPr>
+          <w:p>
+            <w:pPr>
+              <w:spacing w:after="0" w:line="259" w:lineRule="auto"/>
+            </w:pPr>
+            <w:r>
+              <w:rPr>
+                <w:rFonts w:ascii="Calibri" w:hAnsi="Calibri" w:eastAsia="Microsoft YaHei"/>
+                <w:b w:val="0"/>
+                <w:color w:val="1F2937"/>
+                <w:sz w:val="15"/>
+              </w:rPr>
+              <w:t>线索、来源、负责人、销售机会进度、客户编号、客户类别、团队、活动、介绍人推荐码</w:t>
+            </w:r>
+          </w:p>
+        </w:tc>
+        <w:tc>
+          <w:tcPr>
+            <w:tcW w:type="dxa" w:w="3168"/>
+            <w:tcMar>
+              <w:top w:w="75" w:type="dxa"/>
+              <w:start w:w="100" w:type="dxa"/>
+              <w:bottom w:w="75" w:type="dxa"/>
+              <w:end w:w="100" w:type="dxa"/>
+            </w:tcMar>
+            <w:vAlign w:val="center"/>
+            <w:shd w:fill="F4F7FB"/>
+          </w:tcPr>
+          <w:p>
+            <w:pPr>
+              <w:spacing w:after="0" w:line="259" w:lineRule="auto"/>
+            </w:pPr>
+            <w:r>
+              <w:rPr>
+                <w:rFonts w:ascii="Calibri" w:hAnsi="Calibri" w:eastAsia="Microsoft YaHei"/>
+                <w:b w:val="0"/>
+                <w:color w:val="1F2937"/>
+                <w:sz w:val="15"/>
+              </w:rPr>
+              <w:t>显示名称加业务编号；有查看权限时可打开关联对象，无权限时只显示允许的摘要。</w:t>
+            </w:r>
+          </w:p>
+        </w:tc>
+      </w:tr>
+      <w:tr>
+        <w:trPr>
+          <w:cantSplit/>
+        </w:trPr>
+        <w:tc>
+          <w:tcPr>
+            <w:tcW w:type="dxa" w:w="2088"/>
+            <w:tcMar>
+              <w:top w:w="75" w:type="dxa"/>
+              <w:start w:w="100" w:type="dxa"/>
+              <w:bottom w:w="75" w:type="dxa"/>
+              <w:end w:w="100" w:type="dxa"/>
+            </w:tcMar>
+            <w:vAlign w:val="center"/>
+          </w:tcPr>
+          <w:p>
+            <w:pPr>
+              <w:spacing w:after="0" w:line="259" w:lineRule="auto"/>
+            </w:pPr>
+            <w:r>
+              <w:rPr>
+                <w:rFonts w:ascii="Calibri" w:hAnsi="Calibri" w:eastAsia="Microsoft YaHei"/>
+                <w:b w:val="0"/>
+                <w:color w:val="1F2937"/>
+                <w:sz w:val="15"/>
+              </w:rPr>
+              <w:t>金额数量与业务配置</w:t>
+            </w:r>
+          </w:p>
+        </w:tc>
+        <w:tc>
+          <w:tcPr>
+            <w:tcW w:type="dxa" w:w="4968"/>
+            <w:tcMar>
+              <w:top w:w="75" w:type="dxa"/>
+              <w:start w:w="100" w:type="dxa"/>
+              <w:bottom w:w="75" w:type="dxa"/>
+              <w:end w:w="100" w:type="dxa"/>
+            </w:tcMar>
+            <w:vAlign w:val="center"/>
+          </w:tcPr>
+          <w:p>
+            <w:pPr>
+              <w:spacing w:after="0" w:line="259" w:lineRule="auto"/>
+            </w:pPr>
+            <w:r>
+              <w:rPr>
+                <w:rFonts w:ascii="Calibri" w:hAnsi="Calibri" w:eastAsia="Microsoft YaHei"/>
+                <w:b w:val="0"/>
+                <w:color w:val="1F2937"/>
+                <w:sz w:val="15"/>
+              </w:rPr>
+              <w:t>商议金额、呎吋</w:t>
+            </w:r>
+          </w:p>
+        </w:tc>
+        <w:tc>
+          <w:tcPr>
+            <w:tcW w:type="dxa" w:w="3168"/>
+            <w:tcMar>
+              <w:top w:w="75" w:type="dxa"/>
+              <w:start w:w="100" w:type="dxa"/>
+              <w:bottom w:w="75" w:type="dxa"/>
+              <w:end w:w="100" w:type="dxa"/>
+            </w:tcMar>
+            <w:vAlign w:val="center"/>
+          </w:tcPr>
+          <w:p>
+            <w:pPr>
+              <w:spacing w:after="0" w:line="259" w:lineRule="auto"/>
+            </w:pPr>
+            <w:r>
+              <w:rPr>
+                <w:rFonts w:ascii="Calibri" w:hAnsi="Calibri" w:eastAsia="Microsoft YaHei"/>
+                <w:b w:val="0"/>
+                <w:color w:val="1F2937"/>
+                <w:sz w:val="15"/>
+              </w:rPr>
+              <w:t>显示原始值、单位、币种和有效版本；金额与数量由服务端返回，前端不得二次推导覆盖。</w:t>
+            </w:r>
+          </w:p>
+        </w:tc>
+      </w:tr>
+      <w:tr>
+        <w:trPr>
+          <w:cantSplit/>
+        </w:trPr>
+        <w:tc>
+          <w:tcPr>
+            <w:tcW w:type="dxa" w:w="2088"/>
+            <w:tcMar>
+              <w:top w:w="75" w:type="dxa"/>
+              <w:start w:w="100" w:type="dxa"/>
+              <w:bottom w:w="75" w:type="dxa"/>
+              <w:end w:w="100" w:type="dxa"/>
+            </w:tcMar>
+            <w:vAlign w:val="center"/>
+            <w:shd w:fill="F4F7FB"/>
+          </w:tcPr>
+          <w:p>
+            <w:pPr>
+              <w:spacing w:after="0" w:line="259" w:lineRule="auto"/>
+            </w:pPr>
+            <w:r>
+              <w:rPr>
+                <w:rFonts w:ascii="Calibri" w:hAnsi="Calibri" w:eastAsia="Microsoft YaHei"/>
+                <w:b w:val="0"/>
+                <w:color w:val="1F2937"/>
+                <w:sz w:val="15"/>
+              </w:rPr>
+              <w:t>状态责任与时间</w:t>
+            </w:r>
+          </w:p>
+        </w:tc>
+        <w:tc>
+          <w:tcPr>
+            <w:tcW w:type="dxa" w:w="4968"/>
+            <w:tcMar>
+              <w:top w:w="75" w:type="dxa"/>
+              <w:start w:w="100" w:type="dxa"/>
+              <w:bottom w:w="75" w:type="dxa"/>
+              <w:end w:w="100" w:type="dxa"/>
+            </w:tcMar>
+            <w:vAlign w:val="center"/>
+            <w:shd w:fill="F4F7FB"/>
+          </w:tcPr>
+          <w:p>
+            <w:pPr>
+              <w:spacing w:after="0" w:line="259" w:lineRule="auto"/>
+            </w:pPr>
+            <w:r>
+              <w:rPr>
+                <w:rFonts w:ascii="Calibri" w:hAnsi="Calibri" w:eastAsia="Microsoft YaHei"/>
+                <w:b w:val="0"/>
+                <w:color w:val="1F2937"/>
+                <w:sz w:val="15"/>
+              </w:rPr>
+              <w:t>跟进状态、转化状态、状态、出生日期</w:t>
+            </w:r>
+          </w:p>
+        </w:tc>
+        <w:tc>
+          <w:tcPr>
+            <w:tcW w:type="dxa" w:w="3168"/>
+            <w:tcMar>
+              <w:top w:w="75" w:type="dxa"/>
+              <w:start w:w="100" w:type="dxa"/>
+              <w:bottom w:w="75" w:type="dxa"/>
+              <w:end w:w="100" w:type="dxa"/>
+            </w:tcMar>
+            <w:vAlign w:val="center"/>
+            <w:shd w:fill="F4F7FB"/>
+          </w:tcPr>
+          <w:p>
+            <w:pPr>
+              <w:spacing w:after="0" w:line="259" w:lineRule="auto"/>
+            </w:pPr>
+            <w:r>
+              <w:rPr>
+                <w:rFonts w:ascii="Calibri" w:hAnsi="Calibri" w:eastAsia="Microsoft YaHei"/>
+                <w:b w:val="0"/>
+                <w:color w:val="1F2937"/>
+                <w:sz w:val="15"/>
+              </w:rPr>
+              <w:t>显示当前状态、负责人、业务时间和服务器更新时间；状态由服务端枚举与时间线共同解释。</w:t>
+            </w:r>
+          </w:p>
+        </w:tc>
+      </w:tr>
+      <w:tr>
+        <w:trPr>
+          <w:cantSplit/>
+        </w:trPr>
+        <w:tc>
+          <w:tcPr>
+            <w:tcW w:type="dxa" w:w="2088"/>
+            <w:tcMar>
+              <w:top w:w="75" w:type="dxa"/>
+              <w:start w:w="100" w:type="dxa"/>
+              <w:bottom w:w="75" w:type="dxa"/>
+              <w:end w:w="100" w:type="dxa"/>
+            </w:tcMar>
+            <w:vAlign w:val="center"/>
+          </w:tcPr>
+          <w:p>
+            <w:pPr>
+              <w:spacing w:after="0" w:line="259" w:lineRule="auto"/>
+            </w:pPr>
+            <w:r>
+              <w:rPr>
+                <w:rFonts w:ascii="Calibri" w:hAnsi="Calibri" w:eastAsia="Microsoft YaHei"/>
+                <w:b w:val="0"/>
+                <w:color w:val="1F2937"/>
+                <w:sz w:val="15"/>
+              </w:rPr>
+              <w:t>附件说明与补充信息</w:t>
+            </w:r>
+          </w:p>
+        </w:tc>
+        <w:tc>
+          <w:tcPr>
+            <w:tcW w:type="dxa" w:w="4968"/>
+            <w:tcMar>
+              <w:top w:w="75" w:type="dxa"/>
+              <w:start w:w="100" w:type="dxa"/>
+              <w:bottom w:w="75" w:type="dxa"/>
+              <w:end w:w="100" w:type="dxa"/>
+            </w:tcMar>
+            <w:vAlign w:val="center"/>
+          </w:tcPr>
+          <w:p>
+            <w:pPr>
+              <w:spacing w:after="0" w:line="259" w:lineRule="auto"/>
+            </w:pPr>
+            <w:r>
+              <w:rPr>
+                <w:rFonts w:ascii="Calibri" w:hAnsi="Calibri" w:eastAsia="Microsoft YaHei"/>
+                <w:b w:val="0"/>
+                <w:color w:val="1F2937"/>
+                <w:sz w:val="15"/>
+              </w:rPr>
+              <w:t>个人地址、个人地址国家、公司地址国家、公司地址、返回原因、描述、备注</w:t>
+            </w:r>
+          </w:p>
+        </w:tc>
+        <w:tc>
+          <w:tcPr>
+            <w:tcW w:type="dxa" w:w="3168"/>
+            <w:tcMar>
+              <w:top w:w="75" w:type="dxa"/>
+              <w:start w:w="100" w:type="dxa"/>
+              <w:bottom w:w="75" w:type="dxa"/>
+              <w:end w:w="100" w:type="dxa"/>
+            </w:tcMar>
+            <w:vAlign w:val="center"/>
+          </w:tcPr>
+          <w:p>
+            <w:pPr>
+              <w:spacing w:after="0" w:line="259" w:lineRule="auto"/>
+            </w:pPr>
+            <w:r>
+              <w:rPr>
+                <w:rFonts w:ascii="Calibri" w:hAnsi="Calibri" w:eastAsia="Microsoft YaHei"/>
+                <w:b w:val="0"/>
+                <w:color w:val="1F2937"/>
+                <w:sz w:val="15"/>
+              </w:rPr>
+              <w:t>附件展示文件名、版本、扫描状态和权限动作；长文本保留换行并记录创建人与时间。</w:t>
+            </w:r>
+          </w:p>
+        </w:tc>
+      </w:tr>
+      <w:tr>
+        <w:trPr>
+          <w:cantSplit/>
+        </w:trPr>
+        <w:tc>
+          <w:tcPr>
+            <w:tcW w:type="dxa" w:w="2088"/>
+            <w:tcMar>
+              <w:top w:w="75" w:type="dxa"/>
+              <w:start w:w="100" w:type="dxa"/>
+              <w:bottom w:w="75" w:type="dxa"/>
+              <w:end w:w="100" w:type="dxa"/>
+            </w:tcMar>
+            <w:vAlign w:val="center"/>
+            <w:shd w:fill="F4F7FB"/>
+          </w:tcPr>
+          <w:p>
+            <w:pPr>
+              <w:spacing w:after="0" w:line="259" w:lineRule="auto"/>
+            </w:pPr>
+            <w:r>
+              <w:rPr>
+                <w:rFonts w:ascii="Calibri" w:hAnsi="Calibri" w:eastAsia="Microsoft YaHei"/>
+                <w:b w:val="0"/>
+                <w:color w:val="1F2937"/>
+                <w:sz w:val="15"/>
+              </w:rPr>
+              <w:t>系统与审计信息</w:t>
+            </w:r>
+          </w:p>
+        </w:tc>
+        <w:tc>
+          <w:tcPr>
+            <w:tcW w:type="dxa" w:w="4968"/>
+            <w:tcMar>
+              <w:top w:w="75" w:type="dxa"/>
+              <w:start w:w="100" w:type="dxa"/>
+              <w:bottom w:w="75" w:type="dxa"/>
+              <w:end w:w="100" w:type="dxa"/>
+            </w:tcMar>
+            <w:vAlign w:val="center"/>
+            <w:shd w:fill="F4F7FB"/>
+          </w:tcPr>
+          <w:p>
+            <w:pPr>
+              <w:spacing w:after="0" w:line="259" w:lineRule="auto"/>
+            </w:pPr>
+            <w:r>
+              <w:rPr>
+                <w:rFonts w:ascii="Calibri" w:hAnsi="Calibri" w:eastAsia="Microsoft YaHei"/>
+                <w:b w:val="0"/>
+                <w:color w:val="1F2937"/>
+                <w:sz w:val="15"/>
+              </w:rPr>
+              <w:t>version、createdAt、createdBy、updatedAt、updatedBy、sourceChannel、requestId</w:t>
+            </w:r>
+          </w:p>
+        </w:tc>
+        <w:tc>
+          <w:tcPr>
+            <w:tcW w:type="dxa" w:w="3168"/>
+            <w:tcMar>
+              <w:top w:w="75" w:type="dxa"/>
+              <w:start w:w="100" w:type="dxa"/>
+              <w:bottom w:w="75" w:type="dxa"/>
+              <w:end w:w="100" w:type="dxa"/>
+            </w:tcMar>
+            <w:vAlign w:val="center"/>
+            <w:shd w:fill="F4F7FB"/>
+          </w:tcPr>
+          <w:p>
+            <w:pPr>
+              <w:spacing w:after="0" w:line="259" w:lineRule="auto"/>
+            </w:pPr>
+            <w:r>
+              <w:rPr>
+                <w:rFonts w:ascii="Calibri" w:hAnsi="Calibri" w:eastAsia="Microsoft YaHei"/>
+                <w:b w:val="0"/>
+                <w:color w:val="1F2937"/>
+                <w:sz w:val="15"/>
+              </w:rPr>
+              <w:t>作为详情响应固定字段；用于并发控制、来源说明和操作追踪，不允许前端伪造。</w:t>
+            </w:r>
+          </w:p>
+        </w:tc>
+      </w:tr>
+    </w:tbl>
+    <w:p>
+      <w:pPr>
+        <w:spacing w:after="0"/>
+      </w:pPr>
+    </w:p>
+    <w:p>
+      <w:pPr>
+        <w:pStyle w:val="Heading2"/>
+      </w:pPr>
+      <w:r>
+        <w:t>5.5 状态时间线与处理记录</w:t>
+      </w:r>
+    </w:p>
+    <w:tbl>
+      <w:tblPr>
+        <w:tblStyle w:val="TableGrid"/>
+        <w:tblW w:type="dxa" w:w="10368"/>
+        <w:jc w:val="center"/>
+        <w:tblLayout w:type="fixed"/>
+        <w:tblLook w:firstColumn="1" w:firstRow="1" w:lastColumn="0" w:lastRow="0" w:noHBand="0" w:noVBand="1" w:val="04A0"/>
+      </w:tblPr>
+      <w:tblGrid>
+        <w:gridCol w:w="1800"/>
+        <w:gridCol w:w="3816"/>
+        <w:gridCol w:w="4752"/>
+      </w:tblGrid>
+      <w:tr>
+        <w:trPr>
+          <w:tblHeader/>
+        </w:trPr>
+        <w:tc>
+          <w:tcPr>
+            <w:tcW w:type="dxa" w:w="1800"/>
+            <w:shd w:fill="17365D"/>
+            <w:tcMar>
+              <w:top w:w="75" w:type="dxa"/>
+              <w:start w:w="100" w:type="dxa"/>
+              <w:bottom w:w="75" w:type="dxa"/>
+              <w:end w:w="100" w:type="dxa"/>
+            </w:tcMar>
+            <w:vAlign w:val="center"/>
+          </w:tcPr>
+          <w:p>
+            <w:r>
+              <w:rPr>
+                <w:rFonts w:ascii="Calibri" w:hAnsi="Calibri" w:eastAsia="Microsoft YaHei"/>
+                <w:b/>
+                <w:color w:val="FFFFFF"/>
+                <w:sz w:val="15"/>
+              </w:rPr>
+              <w:t>区域</w:t>
+            </w:r>
+          </w:p>
+        </w:tc>
+        <w:tc>
+          <w:tcPr>
+            <w:tcW w:type="dxa" w:w="3816"/>
+            <w:shd w:fill="17365D"/>
+            <w:tcMar>
+              <w:top w:w="75" w:type="dxa"/>
+              <w:start w:w="100" w:type="dxa"/>
+              <w:bottom w:w="75" w:type="dxa"/>
+              <w:end w:w="100" w:type="dxa"/>
+            </w:tcMar>
+            <w:vAlign w:val="center"/>
+          </w:tcPr>
+          <w:p>
+            <w:r>
+              <w:rPr>
+                <w:rFonts w:ascii="Calibri" w:hAnsi="Calibri" w:eastAsia="Microsoft YaHei"/>
+                <w:b/>
+                <w:color w:val="FFFFFF"/>
+                <w:sz w:val="15"/>
+              </w:rPr>
+              <w:t>内容</w:t>
+            </w:r>
+          </w:p>
+        </w:tc>
+        <w:tc>
+          <w:tcPr>
+            <w:tcW w:type="dxa" w:w="4752"/>
+            <w:shd w:fill="17365D"/>
+            <w:tcMar>
+              <w:top w:w="75" w:type="dxa"/>
+              <w:start w:w="100" w:type="dxa"/>
+              <w:bottom w:w="75" w:type="dxa"/>
+              <w:end w:w="100" w:type="dxa"/>
+            </w:tcMar>
+            <w:vAlign w:val="center"/>
+          </w:tcPr>
+          <w:p>
+            <w:r>
+              <w:rPr>
+                <w:rFonts w:ascii="Calibri" w:hAnsi="Calibri" w:eastAsia="Microsoft YaHei"/>
+                <w:b/>
+                <w:color w:val="FFFFFF"/>
+                <w:sz w:val="15"/>
+              </w:rPr>
+              <w:t>规则</w:t>
+            </w:r>
+          </w:p>
+        </w:tc>
+      </w:tr>
+      <w:tr>
+        <w:trPr>
+          <w:cantSplit/>
+        </w:trPr>
+        <w:tc>
+          <w:tcPr>
+            <w:tcW w:type="dxa" w:w="1800"/>
+            <w:tcMar>
+              <w:top w:w="75" w:type="dxa"/>
+              <w:start w:w="100" w:type="dxa"/>
+              <w:bottom w:w="75" w:type="dxa"/>
+              <w:end w:w="100" w:type="dxa"/>
+            </w:tcMar>
+            <w:vAlign w:val="center"/>
+          </w:tcPr>
+          <w:p>
+            <w:pPr>
+              <w:spacing w:after="0" w:line="259" w:lineRule="auto"/>
+            </w:pPr>
+            <w:r>
+              <w:rPr>
+                <w:rFonts w:ascii="Calibri" w:hAnsi="Calibri" w:eastAsia="Microsoft YaHei"/>
+                <w:b w:val="0"/>
+                <w:color w:val="1F2937"/>
+                <w:sz w:val="15"/>
+              </w:rPr>
+              <w:t>当前状态</w:t>
+            </w:r>
+          </w:p>
+        </w:tc>
+        <w:tc>
+          <w:tcPr>
+            <w:tcW w:type="dxa" w:w="3816"/>
+            <w:tcMar>
+              <w:top w:w="75" w:type="dxa"/>
+              <w:start w:w="100" w:type="dxa"/>
+              <w:bottom w:w="75" w:type="dxa"/>
+              <w:end w:w="100" w:type="dxa"/>
+            </w:tcMar>
+            <w:vAlign w:val="center"/>
+          </w:tcPr>
+          <w:p>
+            <w:pPr>
+              <w:spacing w:after="0" w:line="259" w:lineRule="auto"/>
+            </w:pPr>
+            <w:r>
+              <w:rPr>
+                <w:rFonts w:ascii="Calibri" w:hAnsi="Calibri" w:eastAsia="Microsoft YaHei"/>
+                <w:b w:val="0"/>
+                <w:color w:val="1F2937"/>
+                <w:sz w:val="15"/>
+              </w:rPr>
+              <w:t>跟进状态：待分配→待跟进→跟进中→已完成；转化状态：未转化→待转机会→已转预约/已转机会→已转订单；可进入无效/取消</w:t>
+            </w:r>
+          </w:p>
+        </w:tc>
+        <w:tc>
+          <w:tcPr>
+            <w:tcW w:type="dxa" w:w="4752"/>
+            <w:tcMar>
+              <w:top w:w="75" w:type="dxa"/>
+              <w:start w:w="100" w:type="dxa"/>
+              <w:bottom w:w="75" w:type="dxa"/>
+              <w:end w:w="100" w:type="dxa"/>
+            </w:tcMar>
+            <w:vAlign w:val="center"/>
+          </w:tcPr>
+          <w:p>
+            <w:pPr>
+              <w:spacing w:after="0" w:line="259" w:lineRule="auto"/>
+            </w:pPr>
+            <w:r>
+              <w:rPr>
+                <w:rFonts w:ascii="Calibri" w:hAnsi="Calibri" w:eastAsia="Microsoft YaHei"/>
+                <w:b w:val="0"/>
+                <w:color w:val="1F2937"/>
+                <w:sz w:val="15"/>
+              </w:rPr>
+              <w:t>由服务端currentStatus和statusLabel返回；页面不得根据按钮、时间或关联对象自行推断。</w:t>
+            </w:r>
+          </w:p>
+        </w:tc>
+      </w:tr>
+      <w:tr>
+        <w:trPr>
+          <w:cantSplit/>
+        </w:trPr>
+        <w:tc>
+          <w:tcPr>
+            <w:tcW w:type="dxa" w:w="1800"/>
+            <w:tcMar>
+              <w:top w:w="75" w:type="dxa"/>
+              <w:start w:w="100" w:type="dxa"/>
+              <w:bottom w:w="75" w:type="dxa"/>
+              <w:end w:w="100" w:type="dxa"/>
+            </w:tcMar>
+            <w:vAlign w:val="center"/>
+            <w:shd w:fill="F4F7FB"/>
+          </w:tcPr>
+          <w:p>
+            <w:pPr>
+              <w:spacing w:after="0" w:line="259" w:lineRule="auto"/>
+            </w:pPr>
+            <w:r>
+              <w:rPr>
+                <w:rFonts w:ascii="Calibri" w:hAnsi="Calibri" w:eastAsia="Microsoft YaHei"/>
+                <w:b w:val="0"/>
+                <w:color w:val="1F2937"/>
+                <w:sz w:val="15"/>
+              </w:rPr>
+              <w:t>状态时间线</w:t>
+            </w:r>
+          </w:p>
+        </w:tc>
+        <w:tc>
+          <w:tcPr>
+            <w:tcW w:type="dxa" w:w="3816"/>
+            <w:tcMar>
+              <w:top w:w="75" w:type="dxa"/>
+              <w:start w:w="100" w:type="dxa"/>
+              <w:bottom w:w="75" w:type="dxa"/>
+              <w:end w:w="100" w:type="dxa"/>
+            </w:tcMar>
+            <w:vAlign w:val="center"/>
+            <w:shd w:fill="F4F7FB"/>
+          </w:tcPr>
+          <w:p>
+            <w:pPr>
+              <w:spacing w:after="0" w:line="259" w:lineRule="auto"/>
+            </w:pPr>
+            <w:r>
+              <w:rPr>
+                <w:rFonts w:ascii="Calibri" w:hAnsi="Calibri" w:eastAsia="Microsoft YaHei"/>
+                <w:b w:val="0"/>
+                <w:color w:val="1F2937"/>
+                <w:sz w:val="15"/>
+              </w:rPr>
+              <w:t>创建、分派或提交、审批、执行、完成、取消、失败、恢复等有效节点</w:t>
+            </w:r>
+          </w:p>
+        </w:tc>
+        <w:tc>
+          <w:tcPr>
+            <w:tcW w:type="dxa" w:w="4752"/>
+            <w:tcMar>
+              <w:top w:w="75" w:type="dxa"/>
+              <w:start w:w="100" w:type="dxa"/>
+              <w:bottom w:w="75" w:type="dxa"/>
+              <w:end w:w="100" w:type="dxa"/>
+            </w:tcMar>
+            <w:vAlign w:val="center"/>
+            <w:shd w:fill="F4F7FB"/>
+          </w:tcPr>
+          <w:p>
+            <w:pPr>
+              <w:spacing w:after="0" w:line="259" w:lineRule="auto"/>
+            </w:pPr>
+            <w:r>
+              <w:rPr>
+                <w:rFonts w:ascii="Calibri" w:hAnsi="Calibri" w:eastAsia="Microsoft YaHei"/>
+                <w:b w:val="0"/>
+                <w:color w:val="1F2937"/>
+                <w:sz w:val="15"/>
+              </w:rPr>
+              <w:t>每个节点显示eventId、状态、业务时间、服务器接收时间、操作者、来源端、原因和结果；重试不得覆盖历史。</w:t>
+            </w:r>
+          </w:p>
+        </w:tc>
+      </w:tr>
+      <w:tr>
+        <w:trPr>
+          <w:cantSplit/>
+        </w:trPr>
+        <w:tc>
+          <w:tcPr>
+            <w:tcW w:type="dxa" w:w="1800"/>
+            <w:tcMar>
+              <w:top w:w="75" w:type="dxa"/>
+              <w:start w:w="100" w:type="dxa"/>
+              <w:bottom w:w="75" w:type="dxa"/>
+              <w:end w:w="100" w:type="dxa"/>
+            </w:tcMar>
+            <w:vAlign w:val="center"/>
+          </w:tcPr>
+          <w:p>
+            <w:pPr>
+              <w:spacing w:after="0" w:line="259" w:lineRule="auto"/>
+            </w:pPr>
+            <w:r>
+              <w:rPr>
+                <w:rFonts w:ascii="Calibri" w:hAnsi="Calibri" w:eastAsia="Microsoft YaHei"/>
+                <w:b w:val="0"/>
+                <w:color w:val="1F2937"/>
+                <w:sz w:val="15"/>
+              </w:rPr>
+              <w:t>操作记录</w:t>
+            </w:r>
+          </w:p>
+        </w:tc>
+        <w:tc>
+          <w:tcPr>
+            <w:tcW w:type="dxa" w:w="3816"/>
+            <w:tcMar>
+              <w:top w:w="75" w:type="dxa"/>
+              <w:start w:w="100" w:type="dxa"/>
+              <w:bottom w:w="75" w:type="dxa"/>
+              <w:end w:w="100" w:type="dxa"/>
+            </w:tcMar>
+            <w:vAlign w:val="center"/>
+          </w:tcPr>
+          <w:p>
+            <w:pPr>
+              <w:spacing w:after="0" w:line="259" w:lineRule="auto"/>
+            </w:pPr>
+            <w:r>
+              <w:rPr>
+                <w:rFonts w:ascii="Calibri" w:hAnsi="Calibri" w:eastAsia="Microsoft YaHei"/>
+                <w:b w:val="0"/>
+                <w:color w:val="1F2937"/>
+                <w:sz w:val="15"/>
+              </w:rPr>
+              <w:t>新增、编辑、状态动作、关联变更、下载、导出和权限拒绝</w:t>
+            </w:r>
+          </w:p>
+        </w:tc>
+        <w:tc>
+          <w:tcPr>
+            <w:tcW w:type="dxa" w:w="4752"/>
+            <w:tcMar>
+              <w:top w:w="75" w:type="dxa"/>
+              <w:start w:w="100" w:type="dxa"/>
+              <w:bottom w:w="75" w:type="dxa"/>
+              <w:end w:w="100" w:type="dxa"/>
+            </w:tcMar>
+            <w:vAlign w:val="center"/>
+          </w:tcPr>
+          <w:p>
+            <w:pPr>
+              <w:spacing w:after="0" w:line="259" w:lineRule="auto"/>
+            </w:pPr>
+            <w:r>
+              <w:rPr>
+                <w:rFonts w:ascii="Calibri" w:hAnsi="Calibri" w:eastAsia="Microsoft YaHei"/>
+                <w:b w:val="0"/>
+                <w:color w:val="1F2937"/>
+                <w:sz w:val="15"/>
+              </w:rPr>
+              <w:t>按发生时间倒序分页；字段变化显示前后值摘要，敏感原文继续脱敏。</w:t>
+            </w:r>
+          </w:p>
+        </w:tc>
+      </w:tr>
+      <w:tr>
+        <w:trPr>
+          <w:cantSplit/>
+        </w:trPr>
+        <w:tc>
+          <w:tcPr>
+            <w:tcW w:type="dxa" w:w="1800"/>
+            <w:tcMar>
+              <w:top w:w="75" w:type="dxa"/>
+              <w:start w:w="100" w:type="dxa"/>
+              <w:bottom w:w="75" w:type="dxa"/>
+              <w:end w:w="100" w:type="dxa"/>
+            </w:tcMar>
+            <w:vAlign w:val="center"/>
+            <w:shd w:fill="F4F7FB"/>
+          </w:tcPr>
+          <w:p>
+            <w:pPr>
+              <w:spacing w:after="0" w:line="259" w:lineRule="auto"/>
+            </w:pPr>
+            <w:r>
+              <w:rPr>
+                <w:rFonts w:ascii="Calibri" w:hAnsi="Calibri" w:eastAsia="Microsoft YaHei"/>
+                <w:b w:val="0"/>
+                <w:color w:val="1F2937"/>
+                <w:sz w:val="15"/>
+              </w:rPr>
+              <w:t>异步任务</w:t>
+            </w:r>
+          </w:p>
+        </w:tc>
+        <w:tc>
+          <w:tcPr>
+            <w:tcW w:type="dxa" w:w="3816"/>
+            <w:tcMar>
+              <w:top w:w="75" w:type="dxa"/>
+              <w:start w:w="100" w:type="dxa"/>
+              <w:bottom w:w="75" w:type="dxa"/>
+              <w:end w:w="100" w:type="dxa"/>
+            </w:tcMar>
+            <w:vAlign w:val="center"/>
+            <w:shd w:fill="F4F7FB"/>
+          </w:tcPr>
+          <w:p>
+            <w:pPr>
+              <w:spacing w:after="0" w:line="259" w:lineRule="auto"/>
+            </w:pPr>
+            <w:r>
+              <w:rPr>
+                <w:rFonts w:ascii="Calibri" w:hAnsi="Calibri" w:eastAsia="Microsoft YaHei"/>
+                <w:b w:val="0"/>
+                <w:color w:val="1F2937"/>
+                <w:sz w:val="15"/>
+              </w:rPr>
+              <w:t>通知、同步、文件处理、第三方回调、导出或补偿任务</w:t>
+            </w:r>
+          </w:p>
+        </w:tc>
+        <w:tc>
+          <w:tcPr>
+            <w:tcW w:type="dxa" w:w="4752"/>
+            <w:tcMar>
+              <w:top w:w="75" w:type="dxa"/>
+              <w:start w:w="100" w:type="dxa"/>
+              <w:bottom w:w="75" w:type="dxa"/>
+              <w:end w:w="100" w:type="dxa"/>
+            </w:tcMar>
+            <w:vAlign w:val="center"/>
+            <w:shd w:fill="F4F7FB"/>
+          </w:tcPr>
+          <w:p>
+            <w:pPr>
+              <w:spacing w:after="0" w:line="259" w:lineRule="auto"/>
+            </w:pPr>
+            <w:r>
+              <w:rPr>
+                <w:rFonts w:ascii="Calibri" w:hAnsi="Calibri" w:eastAsia="Microsoft YaHei"/>
+                <w:b w:val="0"/>
+                <w:color w:val="1F2937"/>
+                <w:sz w:val="15"/>
+              </w:rPr>
+              <w:t>显示任务编号、当前状态、重试次数、最近错误和下一次重试时间；主事务成功与异步失败分开表达。</w:t>
+            </w:r>
+          </w:p>
+        </w:tc>
+      </w:tr>
+    </w:tbl>
+    <w:p>
+      <w:pPr>
+        <w:spacing w:after="0"/>
+      </w:pPr>
+    </w:p>
+    <w:p>
+      <w:pPr>
+        <w:pStyle w:val="Heading2"/>
+      </w:pPr>
+      <w:r>
+        <w:t>5.6 关联对象与页签规则</w:t>
+      </w:r>
+    </w:p>
+    <w:tbl>
+      <w:tblPr>
+        <w:tblStyle w:val="TableGrid"/>
+        <w:tblW w:type="dxa" w:w="10368"/>
+        <w:jc w:val="center"/>
+        <w:tblLayout w:type="fixed"/>
+        <w:tblLook w:firstColumn="1" w:firstRow="1" w:lastColumn="0" w:lastRow="0" w:noHBand="0" w:noVBand="1" w:val="04A0"/>
+      </w:tblPr>
+      <w:tblGrid>
+        <w:gridCol w:w="1800"/>
+        <w:gridCol w:w="4032"/>
+        <w:gridCol w:w="4536"/>
+      </w:tblGrid>
+      <w:tr>
+        <w:trPr>
+          <w:tblHeader/>
+        </w:trPr>
+        <w:tc>
+          <w:tcPr>
+            <w:tcW w:type="dxa" w:w="1800"/>
+            <w:shd w:fill="17365D"/>
+            <w:tcMar>
+              <w:top w:w="75" w:type="dxa"/>
+              <w:start w:w="100" w:type="dxa"/>
+              <w:bottom w:w="75" w:type="dxa"/>
+              <w:end w:w="100" w:type="dxa"/>
+            </w:tcMar>
+            <w:vAlign w:val="center"/>
+          </w:tcPr>
+          <w:p>
+            <w:r>
+              <w:rPr>
+                <w:rFonts w:ascii="Calibri" w:hAnsi="Calibri" w:eastAsia="Microsoft YaHei"/>
+                <w:b/>
+                <w:color w:val="FFFFFF"/>
+                <w:sz w:val="15"/>
+              </w:rPr>
+              <w:t>页签或区域</w:t>
+            </w:r>
+          </w:p>
+        </w:tc>
+        <w:tc>
+          <w:tcPr>
+            <w:tcW w:type="dxa" w:w="4032"/>
+            <w:shd w:fill="17365D"/>
+            <w:tcMar>
+              <w:top w:w="75" w:type="dxa"/>
+              <w:start w:w="100" w:type="dxa"/>
+              <w:bottom w:w="75" w:type="dxa"/>
+              <w:end w:w="100" w:type="dxa"/>
+            </w:tcMar>
+            <w:vAlign w:val="center"/>
+          </w:tcPr>
+          <w:p>
+            <w:r>
+              <w:rPr>
+                <w:rFonts w:ascii="Calibri" w:hAnsi="Calibri" w:eastAsia="Microsoft YaHei"/>
+                <w:b/>
+                <w:color w:val="FFFFFF"/>
+                <w:sz w:val="15"/>
+              </w:rPr>
+              <w:t>范围</w:t>
+            </w:r>
+          </w:p>
+        </w:tc>
+        <w:tc>
+          <w:tcPr>
+            <w:tcW w:type="dxa" w:w="4536"/>
+            <w:shd w:fill="17365D"/>
+            <w:tcMar>
+              <w:top w:w="75" w:type="dxa"/>
+              <w:start w:w="100" w:type="dxa"/>
+              <w:bottom w:w="75" w:type="dxa"/>
+              <w:end w:w="100" w:type="dxa"/>
+            </w:tcMar>
+            <w:vAlign w:val="center"/>
+          </w:tcPr>
+          <w:p>
+            <w:r>
+              <w:rPr>
+                <w:rFonts w:ascii="Calibri" w:hAnsi="Calibri" w:eastAsia="Microsoft YaHei"/>
+                <w:b/>
+                <w:color w:val="FFFFFF"/>
+                <w:sz w:val="15"/>
+              </w:rPr>
+              <w:t>规则</w:t>
+            </w:r>
+          </w:p>
+        </w:tc>
+      </w:tr>
+      <w:tr>
+        <w:trPr>
+          <w:cantSplit/>
+        </w:trPr>
+        <w:tc>
+          <w:tcPr>
+            <w:tcW w:type="dxa" w:w="1800"/>
+            <w:tcMar>
+              <w:top w:w="75" w:type="dxa"/>
+              <w:start w:w="100" w:type="dxa"/>
+              <w:bottom w:w="75" w:type="dxa"/>
+              <w:end w:w="100" w:type="dxa"/>
+            </w:tcMar>
+            <w:vAlign w:val="center"/>
+          </w:tcPr>
+          <w:p>
+            <w:pPr>
+              <w:spacing w:after="0" w:line="259" w:lineRule="auto"/>
+            </w:pPr>
+            <w:r>
+              <w:rPr>
+                <w:rFonts w:ascii="Calibri" w:hAnsi="Calibri" w:eastAsia="Microsoft YaHei"/>
+                <w:b w:val="0"/>
+                <w:color w:val="1F2937"/>
+                <w:sz w:val="15"/>
+              </w:rPr>
+              <w:t>基本资料</w:t>
+            </w:r>
+          </w:p>
+        </w:tc>
+        <w:tc>
+          <w:tcPr>
+            <w:tcW w:type="dxa" w:w="4032"/>
+            <w:tcMar>
+              <w:top w:w="75" w:type="dxa"/>
+              <w:start w:w="100" w:type="dxa"/>
+              <w:bottom w:w="75" w:type="dxa"/>
+              <w:end w:w="100" w:type="dxa"/>
+            </w:tcMar>
+            <w:vAlign w:val="center"/>
+          </w:tcPr>
+          <w:p>
+            <w:pPr>
+              <w:spacing w:after="0" w:line="259" w:lineRule="auto"/>
+            </w:pPr>
+            <w:r>
+              <w:rPr>
+                <w:rFonts w:ascii="Calibri" w:hAnsi="Calibri" w:eastAsia="Microsoft YaHei"/>
+                <w:b w:val="0"/>
+                <w:color w:val="1F2937"/>
+                <w:sz w:val="15"/>
+              </w:rPr>
+              <w:t>当前对象全部有效字段</w:t>
+            </w:r>
+          </w:p>
+        </w:tc>
+        <w:tc>
+          <w:tcPr>
+            <w:tcW w:type="dxa" w:w="4536"/>
+            <w:tcMar>
+              <w:top w:w="75" w:type="dxa"/>
+              <w:start w:w="100" w:type="dxa"/>
+              <w:bottom w:w="75" w:type="dxa"/>
+              <w:end w:w="100" w:type="dxa"/>
+            </w:tcMar>
+            <w:vAlign w:val="center"/>
+          </w:tcPr>
+          <w:p>
+            <w:pPr>
+              <w:spacing w:after="0" w:line="259" w:lineRule="auto"/>
+            </w:pPr>
+            <w:r>
+              <w:rPr>
+                <w:rFonts w:ascii="Calibri" w:hAnsi="Calibri" w:eastAsia="Microsoft YaHei"/>
+                <w:b w:val="0"/>
+                <w:color w:val="1F2937"/>
+                <w:sz w:val="15"/>
+              </w:rPr>
+              <w:t>按fieldPermissions显示、脱敏或隐藏；编辑入口只在allowedActions含EDIT时出现。</w:t>
+            </w:r>
+          </w:p>
+        </w:tc>
+      </w:tr>
+      <w:tr>
+        <w:trPr>
+          <w:cantSplit/>
+        </w:trPr>
+        <w:tc>
+          <w:tcPr>
+            <w:tcW w:type="dxa" w:w="1800"/>
+            <w:tcMar>
+              <w:top w:w="75" w:type="dxa"/>
+              <w:start w:w="100" w:type="dxa"/>
+              <w:bottom w:w="75" w:type="dxa"/>
+              <w:end w:w="100" w:type="dxa"/>
+            </w:tcMar>
+            <w:vAlign w:val="center"/>
+            <w:shd w:fill="F4F7FB"/>
+          </w:tcPr>
+          <w:p>
+            <w:pPr>
+              <w:spacing w:after="0" w:line="259" w:lineRule="auto"/>
+            </w:pPr>
+            <w:r>
+              <w:rPr>
+                <w:rFonts w:ascii="Calibri" w:hAnsi="Calibri" w:eastAsia="Microsoft YaHei"/>
+                <w:b w:val="0"/>
+                <w:color w:val="1F2937"/>
+                <w:sz w:val="15"/>
+              </w:rPr>
+              <w:t>关联业务</w:t>
+            </w:r>
+          </w:p>
+        </w:tc>
+        <w:tc>
+          <w:tcPr>
+            <w:tcW w:type="dxa" w:w="4032"/>
+            <w:tcMar>
+              <w:top w:w="75" w:type="dxa"/>
+              <w:start w:w="100" w:type="dxa"/>
+              <w:bottom w:w="75" w:type="dxa"/>
+              <w:end w:w="100" w:type="dxa"/>
+            </w:tcMar>
+            <w:vAlign w:val="center"/>
+            <w:shd w:fill="F4F7FB"/>
+          </w:tcPr>
+          <w:p>
+            <w:pPr>
+              <w:spacing w:after="0" w:line="259" w:lineRule="auto"/>
+            </w:pPr>
+            <w:r>
+              <w:rPr>
+                <w:rFonts w:ascii="Calibri" w:hAnsi="Calibri" w:eastAsia="Microsoft YaHei"/>
+                <w:b w:val="0"/>
+                <w:color w:val="1F2937"/>
+                <w:sz w:val="15"/>
+              </w:rPr>
+              <w:t>客户主档、来源会话、跟进记录、预约、销售机会、销售订单、任务与通知</w:t>
+            </w:r>
+          </w:p>
+        </w:tc>
+        <w:tc>
+          <w:tcPr>
+            <w:tcW w:type="dxa" w:w="4536"/>
+            <w:tcMar>
+              <w:top w:w="75" w:type="dxa"/>
+              <w:start w:w="100" w:type="dxa"/>
+              <w:bottom w:w="75" w:type="dxa"/>
+              <w:end w:w="100" w:type="dxa"/>
+            </w:tcMar>
+            <w:vAlign w:val="center"/>
+            <w:shd w:fill="F4F7FB"/>
+          </w:tcPr>
+          <w:p>
+            <w:pPr>
+              <w:spacing w:after="0" w:line="259" w:lineRule="auto"/>
+            </w:pPr>
+            <w:r>
+              <w:rPr>
+                <w:rFonts w:ascii="Calibri" w:hAnsi="Calibri" w:eastAsia="Microsoft YaHei"/>
+                <w:b w:val="0"/>
+                <w:color w:val="1F2937"/>
+                <w:sz w:val="15"/>
+              </w:rPr>
+              <w:t>关联列表返回对象类型、编号、名称、状态、关系、关键时间和detailUrl；按权限分页加载。</w:t>
+            </w:r>
+          </w:p>
+        </w:tc>
+      </w:tr>
+      <w:tr>
+        <w:trPr>
+          <w:cantSplit/>
+        </w:trPr>
+        <w:tc>
+          <w:tcPr>
+            <w:tcW w:type="dxa" w:w="1800"/>
+            <w:tcMar>
+              <w:top w:w="75" w:type="dxa"/>
+              <w:start w:w="100" w:type="dxa"/>
+              <w:bottom w:w="75" w:type="dxa"/>
+              <w:end w:w="100" w:type="dxa"/>
+            </w:tcMar>
+            <w:vAlign w:val="center"/>
+          </w:tcPr>
+          <w:p>
+            <w:pPr>
+              <w:spacing w:after="0" w:line="259" w:lineRule="auto"/>
+            </w:pPr>
+            <w:r>
+              <w:rPr>
+                <w:rFonts w:ascii="Calibri" w:hAnsi="Calibri" w:eastAsia="Microsoft YaHei"/>
+                <w:b w:val="0"/>
+                <w:color w:val="1F2937"/>
+                <w:sz w:val="15"/>
+              </w:rPr>
+              <w:t>附件与凭证</w:t>
+            </w:r>
+          </w:p>
+        </w:tc>
+        <w:tc>
+          <w:tcPr>
+            <w:tcW w:type="dxa" w:w="4032"/>
+            <w:tcMar>
+              <w:top w:w="75" w:type="dxa"/>
+              <w:start w:w="100" w:type="dxa"/>
+              <w:bottom w:w="75" w:type="dxa"/>
+              <w:end w:w="100" w:type="dxa"/>
+            </w:tcMar>
+            <w:vAlign w:val="center"/>
+          </w:tcPr>
+          <w:p>
+            <w:pPr>
+              <w:spacing w:after="0" w:line="259" w:lineRule="auto"/>
+            </w:pPr>
+            <w:r>
+              <w:rPr>
+                <w:rFonts w:ascii="Calibri" w:hAnsi="Calibri" w:eastAsia="Microsoft YaHei"/>
+                <w:b w:val="0"/>
+                <w:color w:val="1F2937"/>
+                <w:sz w:val="15"/>
+              </w:rPr>
+              <w:t>当前对象及处理过程形成的文件</w:t>
+            </w:r>
+          </w:p>
+        </w:tc>
+        <w:tc>
+          <w:tcPr>
+            <w:tcW w:type="dxa" w:w="4536"/>
+            <w:tcMar>
+              <w:top w:w="75" w:type="dxa"/>
+              <w:start w:w="100" w:type="dxa"/>
+              <w:bottom w:w="75" w:type="dxa"/>
+              <w:end w:w="100" w:type="dxa"/>
+            </w:tcMar>
+            <w:vAlign w:val="center"/>
+          </w:tcPr>
+          <w:p>
+            <w:pPr>
+              <w:spacing w:after="0" w:line="259" w:lineRule="auto"/>
+            </w:pPr>
+            <w:r>
+              <w:rPr>
+                <w:rFonts w:ascii="Calibri" w:hAnsi="Calibri" w:eastAsia="Microsoft YaHei"/>
+                <w:b w:val="0"/>
+                <w:color w:val="1F2937"/>
+                <w:sz w:val="15"/>
+              </w:rPr>
+              <w:t>显示文件版本、上传者、上传时间、扫描状态、哈希和可用动作；预览及下载均审计。</w:t>
+            </w:r>
+          </w:p>
+        </w:tc>
+      </w:tr>
+      <w:tr>
+        <w:trPr>
+          <w:cantSplit/>
+        </w:trPr>
+        <w:tc>
+          <w:tcPr>
+            <w:tcW w:type="dxa" w:w="1800"/>
+            <w:tcMar>
+              <w:top w:w="75" w:type="dxa"/>
+              <w:start w:w="100" w:type="dxa"/>
+              <w:bottom w:w="75" w:type="dxa"/>
+              <w:end w:w="100" w:type="dxa"/>
+            </w:tcMar>
+            <w:vAlign w:val="center"/>
+            <w:shd w:fill="F4F7FB"/>
+          </w:tcPr>
+          <w:p>
+            <w:pPr>
+              <w:spacing w:after="0" w:line="259" w:lineRule="auto"/>
+            </w:pPr>
+            <w:r>
+              <w:rPr>
+                <w:rFonts w:ascii="Calibri" w:hAnsi="Calibri" w:eastAsia="Microsoft YaHei"/>
+                <w:b w:val="0"/>
+                <w:color w:val="1F2937"/>
+                <w:sz w:val="15"/>
+              </w:rPr>
+              <w:t>处理记录</w:t>
+            </w:r>
+          </w:p>
+        </w:tc>
+        <w:tc>
+          <w:tcPr>
+            <w:tcW w:type="dxa" w:w="4032"/>
+            <w:tcMar>
+              <w:top w:w="75" w:type="dxa"/>
+              <w:start w:w="100" w:type="dxa"/>
+              <w:bottom w:w="75" w:type="dxa"/>
+              <w:end w:w="100" w:type="dxa"/>
+            </w:tcMar>
+            <w:vAlign w:val="center"/>
+            <w:shd w:fill="F4F7FB"/>
+          </w:tcPr>
+          <w:p>
+            <w:pPr>
+              <w:spacing w:after="0" w:line="259" w:lineRule="auto"/>
+            </w:pPr>
+            <w:r>
+              <w:rPr>
+                <w:rFonts w:ascii="Calibri" w:hAnsi="Calibri" w:eastAsia="Microsoft YaHei"/>
+                <w:b w:val="0"/>
+                <w:color w:val="1F2937"/>
+                <w:sz w:val="15"/>
+              </w:rPr>
+              <w:t>状态时间线、操作日志和异步任务</w:t>
+            </w:r>
+          </w:p>
+        </w:tc>
+        <w:tc>
+          <w:tcPr>
+            <w:tcW w:type="dxa" w:w="4536"/>
+            <w:tcMar>
+              <w:top w:w="75" w:type="dxa"/>
+              <w:start w:w="100" w:type="dxa"/>
+              <w:bottom w:w="75" w:type="dxa"/>
+              <w:end w:w="100" w:type="dxa"/>
+            </w:tcMar>
+            <w:vAlign w:val="center"/>
+            <w:shd w:fill="F4F7FB"/>
+          </w:tcPr>
+          <w:p>
+            <w:pPr>
+              <w:spacing w:after="0" w:line="259" w:lineRule="auto"/>
+            </w:pPr>
+            <w:r>
+              <w:rPr>
+                <w:rFonts w:ascii="Calibri" w:hAnsi="Calibri" w:eastAsia="Microsoft YaHei"/>
+                <w:b w:val="0"/>
+                <w:color w:val="1F2937"/>
+                <w:sz w:val="15"/>
+              </w:rPr>
+              <w:t>支持按记录类型筛选；默认最新优先，时间字段统一使用Asia/Hong_Kong展示。</w:t>
+            </w:r>
+          </w:p>
+        </w:tc>
+      </w:tr>
+    </w:tbl>
+    <w:p>
+      <w:pPr>
+        <w:spacing w:after="0"/>
+      </w:pPr>
+    </w:p>
+    <w:p>
+      <w:pPr>
+        <w:pStyle w:val="Heading2"/>
+      </w:pPr>
+      <w:r>
+        <w:t>5.7 详情动作与状态控制</w:t>
+      </w:r>
+    </w:p>
+    <w:tbl>
+      <w:tblPr>
+        <w:tblStyle w:val="TableGrid"/>
+        <w:tblW w:type="dxa" w:w="11376"/>
+        <w:jc w:val="center"/>
+        <w:tblLayout w:type="fixed"/>
+        <w:tblLook w:firstColumn="1" w:firstRow="1" w:lastColumn="0" w:lastRow="0" w:noHBand="0" w:noVBand="1" w:val="04A0"/>
+      </w:tblPr>
+      <w:tblGrid>
+        <w:gridCol w:w="1440"/>
+        <w:gridCol w:w="1800"/>
+        <w:gridCol w:w="1944"/>
+        <w:gridCol w:w="3024"/>
+        <w:gridCol w:w="3168"/>
+      </w:tblGrid>
+      <w:tr>
+        <w:trPr>
+          <w:tblHeader/>
+        </w:trPr>
+        <w:tc>
+          <w:tcPr>
+            <w:tcW w:type="dxa" w:w="1440"/>
+            <w:shd w:fill="17365D"/>
+            <w:tcMar>
+              <w:top w:w="75" w:type="dxa"/>
+              <w:start w:w="100" w:type="dxa"/>
+              <w:bottom w:w="75" w:type="dxa"/>
+              <w:end w:w="100" w:type="dxa"/>
+            </w:tcMar>
+            <w:vAlign w:val="center"/>
+          </w:tcPr>
+          <w:p>
+            <w:r>
+              <w:rPr>
+                <w:rFonts w:ascii="Calibri" w:hAnsi="Calibri" w:eastAsia="Microsoft YaHei"/>
+                <w:b/>
+                <w:color w:val="FFFFFF"/>
+                <w:sz w:val="14"/>
+              </w:rPr>
+              <w:t>动作ID</w:t>
+            </w:r>
+          </w:p>
+        </w:tc>
+        <w:tc>
+          <w:tcPr>
+            <w:tcW w:type="dxa" w:w="1800"/>
+            <w:shd w:fill="17365D"/>
+            <w:tcMar>
+              <w:top w:w="75" w:type="dxa"/>
+              <w:start w:w="100" w:type="dxa"/>
+              <w:bottom w:w="75" w:type="dxa"/>
+              <w:end w:w="100" w:type="dxa"/>
+            </w:tcMar>
+            <w:vAlign w:val="center"/>
+          </w:tcPr>
+          <w:p>
+            <w:r>
+              <w:rPr>
+                <w:rFonts w:ascii="Calibri" w:hAnsi="Calibri" w:eastAsia="Microsoft YaHei"/>
+                <w:b/>
+                <w:color w:val="FFFFFF"/>
+                <w:sz w:val="14"/>
+              </w:rPr>
+              <w:t>动作</w:t>
+            </w:r>
+          </w:p>
+        </w:tc>
+        <w:tc>
+          <w:tcPr>
+            <w:tcW w:type="dxa" w:w="1944"/>
+            <w:shd w:fill="17365D"/>
+            <w:tcMar>
+              <w:top w:w="75" w:type="dxa"/>
+              <w:start w:w="100" w:type="dxa"/>
+              <w:bottom w:w="75" w:type="dxa"/>
+              <w:end w:w="100" w:type="dxa"/>
+            </w:tcMar>
+            <w:vAlign w:val="center"/>
+          </w:tcPr>
+          <w:p>
+            <w:r>
+              <w:rPr>
+                <w:rFonts w:ascii="Calibri" w:hAnsi="Calibri" w:eastAsia="Microsoft YaHei"/>
+                <w:b/>
+                <w:color w:val="FFFFFF"/>
+                <w:sz w:val="14"/>
+              </w:rPr>
+              <w:t>角色</w:t>
+            </w:r>
+          </w:p>
+        </w:tc>
+        <w:tc>
+          <w:tcPr>
+            <w:tcW w:type="dxa" w:w="3024"/>
+            <w:shd w:fill="17365D"/>
+            <w:tcMar>
+              <w:top w:w="75" w:type="dxa"/>
+              <w:start w:w="100" w:type="dxa"/>
+              <w:bottom w:w="75" w:type="dxa"/>
+              <w:end w:w="100" w:type="dxa"/>
+            </w:tcMar>
+            <w:vAlign w:val="center"/>
+          </w:tcPr>
+          <w:p>
+            <w:r>
+              <w:rPr>
+                <w:rFonts w:ascii="Calibri" w:hAnsi="Calibri" w:eastAsia="Microsoft YaHei"/>
+                <w:b/>
+                <w:color w:val="FFFFFF"/>
+                <w:sz w:val="14"/>
+              </w:rPr>
+              <w:t>前置条件</w:t>
+            </w:r>
+          </w:p>
+        </w:tc>
+        <w:tc>
+          <w:tcPr>
+            <w:tcW w:type="dxa" w:w="3168"/>
+            <w:shd w:fill="17365D"/>
+            <w:tcMar>
+              <w:top w:w="75" w:type="dxa"/>
+              <w:start w:w="100" w:type="dxa"/>
+              <w:bottom w:w="75" w:type="dxa"/>
+              <w:end w:w="100" w:type="dxa"/>
+            </w:tcMar>
+            <w:vAlign w:val="center"/>
+          </w:tcPr>
+          <w:p>
+            <w:r>
+              <w:rPr>
+                <w:rFonts w:ascii="Calibri" w:hAnsi="Calibri" w:eastAsia="Microsoft YaHei"/>
+                <w:b/>
+                <w:color w:val="FFFFFF"/>
+                <w:sz w:val="14"/>
+              </w:rPr>
+              <w:t>成功及刷新规则</w:t>
+            </w:r>
+          </w:p>
+        </w:tc>
+      </w:tr>
+      <w:tr>
+        <w:trPr>
+          <w:cantSplit/>
+        </w:trPr>
+        <w:tc>
+          <w:tcPr>
+            <w:tcW w:type="dxa" w:w="1440"/>
+            <w:tcMar>
+              <w:top w:w="75" w:type="dxa"/>
+              <w:start w:w="100" w:type="dxa"/>
+              <w:bottom w:w="75" w:type="dxa"/>
+              <w:end w:w="100" w:type="dxa"/>
+            </w:tcMar>
+            <w:vAlign w:val="center"/>
+          </w:tcPr>
+          <w:p>
+            <w:pPr>
+              <w:spacing w:after="0" w:line="259" w:lineRule="auto"/>
+            </w:pPr>
+            <w:r>
+              <w:rPr>
+                <w:rFonts w:ascii="Calibri" w:hAnsi="Calibri" w:eastAsia="Microsoft YaHei"/>
+                <w:b w:val="0"/>
+                <w:color w:val="1F2937"/>
+                <w:sz w:val="14"/>
+              </w:rPr>
+              <w:t>OS-OPS-PRD-02-DA01</w:t>
+            </w:r>
+          </w:p>
+        </w:tc>
+        <w:tc>
+          <w:tcPr>
+            <w:tcW w:type="dxa" w:w="1800"/>
+            <w:tcMar>
+              <w:top w:w="75" w:type="dxa"/>
+              <w:start w:w="100" w:type="dxa"/>
+              <w:bottom w:w="75" w:type="dxa"/>
+              <w:end w:w="100" w:type="dxa"/>
+            </w:tcMar>
+            <w:vAlign w:val="center"/>
+          </w:tcPr>
+          <w:p>
+            <w:pPr>
+              <w:spacing w:after="0" w:line="259" w:lineRule="auto"/>
+            </w:pPr>
+            <w:r>
+              <w:rPr>
+                <w:rFonts w:ascii="Calibri" w:hAnsi="Calibri" w:eastAsia="Microsoft YaHei"/>
+                <w:b w:val="0"/>
+                <w:color w:val="1F2937"/>
+                <w:sz w:val="14"/>
+              </w:rPr>
+              <w:t>新增线索</w:t>
+            </w:r>
+          </w:p>
+        </w:tc>
+        <w:tc>
+          <w:tcPr>
+            <w:tcW w:type="dxa" w:w="1944"/>
+            <w:tcMar>
+              <w:top w:w="75" w:type="dxa"/>
+              <w:start w:w="100" w:type="dxa"/>
+              <w:bottom w:w="75" w:type="dxa"/>
+              <w:end w:w="100" w:type="dxa"/>
+            </w:tcMar>
+            <w:vAlign w:val="center"/>
+          </w:tcPr>
+          <w:p>
+            <w:pPr>
+              <w:spacing w:after="0" w:line="259" w:lineRule="auto"/>
+            </w:pPr>
+            <w:r>
+              <w:rPr>
+                <w:rFonts w:ascii="Calibri" w:hAnsi="Calibri" w:eastAsia="Microsoft YaHei"/>
+                <w:b w:val="0"/>
+                <w:color w:val="1F2937"/>
+                <w:sz w:val="14"/>
+              </w:rPr>
+              <w:t>具备本模块创建权限的运营人员</w:t>
+            </w:r>
+          </w:p>
+        </w:tc>
+        <w:tc>
+          <w:tcPr>
+            <w:tcW w:type="dxa" w:w="3024"/>
+            <w:tcMar>
+              <w:top w:w="75" w:type="dxa"/>
+              <w:start w:w="100" w:type="dxa"/>
+              <w:bottom w:w="75" w:type="dxa"/>
+              <w:end w:w="100" w:type="dxa"/>
+            </w:tcMar>
+            <w:vAlign w:val="center"/>
+          </w:tcPr>
+          <w:p>
+            <w:pPr>
+              <w:spacing w:after="0" w:line="259" w:lineRule="auto"/>
+            </w:pPr>
+            <w:r>
+              <w:rPr>
+                <w:rFonts w:ascii="Calibri" w:hAnsi="Calibri" w:eastAsia="Microsoft YaHei"/>
+                <w:b w:val="0"/>
+                <w:color w:val="1F2937"/>
+                <w:sz w:val="14"/>
+              </w:rPr>
+              <w:t>用户登录有效并具备创建或批量权限；关联主数据有效且属于dataScope；页面已加载最新字典、业务配置和allowedActions。</w:t>
+            </w:r>
+          </w:p>
+        </w:tc>
+        <w:tc>
+          <w:tcPr>
+            <w:tcW w:type="dxa" w:w="3168"/>
+            <w:tcMar>
+              <w:top w:w="75" w:type="dxa"/>
+              <w:start w:w="100" w:type="dxa"/>
+              <w:bottom w:w="75" w:type="dxa"/>
+              <w:end w:w="100" w:type="dxa"/>
+            </w:tcMar>
+            <w:vAlign w:val="center"/>
+          </w:tcPr>
+          <w:p>
+            <w:pPr>
+              <w:spacing w:after="0" w:line="259" w:lineRule="auto"/>
+            </w:pPr>
+            <w:r>
+              <w:rPr>
+                <w:rFonts w:ascii="Calibri" w:hAnsi="Calibri" w:eastAsia="Microsoft YaHei"/>
+                <w:b w:val="0"/>
+                <w:color w:val="1F2937"/>
+                <w:sz w:val="14"/>
+              </w:rPr>
+              <w:t>按客户与联系、个人与地址、租用与归因三个页签录入；先查重，保存后生成唯一 L 编号和首条操作记录。 成功后刷新version、状态、时间线、关联数量和allowedActions；失败不得提前改变界面主状态。</w:t>
+            </w:r>
+          </w:p>
+        </w:tc>
+      </w:tr>
+      <w:tr>
+        <w:trPr>
+          <w:cantSplit/>
+        </w:trPr>
+        <w:tc>
+          <w:tcPr>
+            <w:tcW w:type="dxa" w:w="1440"/>
+            <w:tcMar>
+              <w:top w:w="75" w:type="dxa"/>
+              <w:start w:w="100" w:type="dxa"/>
+              <w:bottom w:w="75" w:type="dxa"/>
+              <w:end w:w="100" w:type="dxa"/>
+            </w:tcMar>
+            <w:vAlign w:val="center"/>
+            <w:shd w:fill="F4F7FB"/>
+          </w:tcPr>
+          <w:p>
+            <w:pPr>
+              <w:spacing w:after="0" w:line="259" w:lineRule="auto"/>
+            </w:pPr>
+            <w:r>
+              <w:rPr>
+                <w:rFonts w:ascii="Calibri" w:hAnsi="Calibri" w:eastAsia="Microsoft YaHei"/>
+                <w:b w:val="0"/>
+                <w:color w:val="1F2937"/>
+                <w:sz w:val="14"/>
+              </w:rPr>
+              <w:t>OS-OPS-PRD-02-DA02</w:t>
+            </w:r>
+          </w:p>
+        </w:tc>
+        <w:tc>
+          <w:tcPr>
+            <w:tcW w:type="dxa" w:w="1800"/>
+            <w:tcMar>
+              <w:top w:w="75" w:type="dxa"/>
+              <w:start w:w="100" w:type="dxa"/>
+              <w:bottom w:w="75" w:type="dxa"/>
+              <w:end w:w="100" w:type="dxa"/>
+            </w:tcMar>
+            <w:vAlign w:val="center"/>
+            <w:shd w:fill="F4F7FB"/>
+          </w:tcPr>
+          <w:p>
+            <w:pPr>
+              <w:spacing w:after="0" w:line="259" w:lineRule="auto"/>
+            </w:pPr>
+            <w:r>
+              <w:rPr>
+                <w:rFonts w:ascii="Calibri" w:hAnsi="Calibri" w:eastAsia="Microsoft YaHei"/>
+                <w:b w:val="0"/>
+                <w:color w:val="1F2937"/>
+                <w:sz w:val="14"/>
+              </w:rPr>
+              <w:t>查看会话来源</w:t>
+            </w:r>
+          </w:p>
+        </w:tc>
+        <w:tc>
+          <w:tcPr>
+            <w:tcW w:type="dxa" w:w="1944"/>
+            <w:tcMar>
+              <w:top w:w="75" w:type="dxa"/>
+              <w:start w:w="100" w:type="dxa"/>
+              <w:bottom w:w="75" w:type="dxa"/>
+              <w:end w:w="100" w:type="dxa"/>
+            </w:tcMar>
+            <w:vAlign w:val="center"/>
+            <w:shd w:fill="F4F7FB"/>
+          </w:tcPr>
+          <w:p>
+            <w:pPr>
+              <w:spacing w:after="0" w:line="259" w:lineRule="auto"/>
+            </w:pPr>
+            <w:r>
+              <w:rPr>
+                <w:rFonts w:ascii="Calibri" w:hAnsi="Calibri" w:eastAsia="Microsoft YaHei"/>
+                <w:b w:val="0"/>
+                <w:color w:val="1F2937"/>
+                <w:sz w:val="14"/>
+              </w:rPr>
+              <w:t>拥有对应dataScope的查询用户</w:t>
+            </w:r>
+          </w:p>
+        </w:tc>
+        <w:tc>
+          <w:tcPr>
+            <w:tcW w:type="dxa" w:w="3024"/>
+            <w:tcMar>
+              <w:top w:w="75" w:type="dxa"/>
+              <w:start w:w="100" w:type="dxa"/>
+              <w:bottom w:w="75" w:type="dxa"/>
+              <w:end w:w="100" w:type="dxa"/>
+            </w:tcMar>
+            <w:vAlign w:val="center"/>
+            <w:shd w:fill="F4F7FB"/>
+          </w:tcPr>
+          <w:p>
+            <w:pPr>
+              <w:spacing w:after="0" w:line="259" w:lineRule="auto"/>
+            </w:pPr>
+            <w:r>
+              <w:rPr>
+                <w:rFonts w:ascii="Calibri" w:hAnsi="Calibri" w:eastAsia="Microsoft YaHei"/>
+                <w:b w:val="0"/>
+                <w:color w:val="1F2937"/>
+                <w:sz w:val="14"/>
+              </w:rPr>
+              <w:t>用户登录有效，拥有菜单和对象查看权限，查询条件属于dataScope；打开详情时对象存在。敏感字段、金额和状态必须回源。</w:t>
+            </w:r>
+          </w:p>
+        </w:tc>
+        <w:tc>
+          <w:tcPr>
+            <w:tcW w:type="dxa" w:w="3168"/>
+            <w:tcMar>
+              <w:top w:w="75" w:type="dxa"/>
+              <w:start w:w="100" w:type="dxa"/>
+              <w:bottom w:w="75" w:type="dxa"/>
+              <w:end w:w="100" w:type="dxa"/>
+            </w:tcMar>
+            <w:vAlign w:val="center"/>
+            <w:shd w:fill="F4F7FB"/>
+          </w:tcPr>
+          <w:p>
+            <w:pPr>
+              <w:spacing w:after="0" w:line="259" w:lineRule="auto"/>
+            </w:pPr>
+            <w:r>
+              <w:rPr>
+                <w:rFonts w:ascii="Calibri" w:hAnsi="Calibri" w:eastAsia="Microsoft YaHei"/>
+                <w:b w:val="0"/>
+                <w:color w:val="1F2937"/>
+                <w:sz w:val="14"/>
+              </w:rPr>
+              <w:t>有关联 AIWA 会话时打开原始上下文、摘要和字段提取依据；无权限时只显示会话编号。 成功后刷新version、状态、时间线、关联数量和allowedActions；失败不得提前改变界面主状态。</w:t>
+            </w:r>
+          </w:p>
+        </w:tc>
+      </w:tr>
+      <w:tr>
+        <w:trPr>
+          <w:cantSplit/>
+        </w:trPr>
+        <w:tc>
+          <w:tcPr>
+            <w:tcW w:type="dxa" w:w="1440"/>
+            <w:tcMar>
+              <w:top w:w="75" w:type="dxa"/>
+              <w:start w:w="100" w:type="dxa"/>
+              <w:bottom w:w="75" w:type="dxa"/>
+              <w:end w:w="100" w:type="dxa"/>
+            </w:tcMar>
+            <w:vAlign w:val="center"/>
+          </w:tcPr>
+          <w:p>
+            <w:pPr>
+              <w:spacing w:after="0" w:line="259" w:lineRule="auto"/>
+            </w:pPr>
+            <w:r>
+              <w:rPr>
+                <w:rFonts w:ascii="Calibri" w:hAnsi="Calibri" w:eastAsia="Microsoft YaHei"/>
+                <w:b w:val="0"/>
+                <w:color w:val="1F2937"/>
+                <w:sz w:val="14"/>
+              </w:rPr>
+              <w:t>OS-OPS-PRD-02-DA03</w:t>
+            </w:r>
+          </w:p>
+        </w:tc>
+        <w:tc>
+          <w:tcPr>
+            <w:tcW w:type="dxa" w:w="1800"/>
+            <w:tcMar>
+              <w:top w:w="75" w:type="dxa"/>
+              <w:start w:w="100" w:type="dxa"/>
+              <w:bottom w:w="75" w:type="dxa"/>
+              <w:end w:w="100" w:type="dxa"/>
+            </w:tcMar>
+            <w:vAlign w:val="center"/>
+          </w:tcPr>
+          <w:p>
+            <w:pPr>
+              <w:spacing w:after="0" w:line="259" w:lineRule="auto"/>
+            </w:pPr>
+            <w:r>
+              <w:rPr>
+                <w:rFonts w:ascii="Calibri" w:hAnsi="Calibri" w:eastAsia="Microsoft YaHei"/>
+                <w:b w:val="0"/>
+                <w:color w:val="1F2937"/>
+                <w:sz w:val="14"/>
+              </w:rPr>
+              <w:t>批量分配</w:t>
+            </w:r>
+          </w:p>
+        </w:tc>
+        <w:tc>
+          <w:tcPr>
+            <w:tcW w:type="dxa" w:w="1944"/>
+            <w:tcMar>
+              <w:top w:w="75" w:type="dxa"/>
+              <w:start w:w="100" w:type="dxa"/>
+              <w:bottom w:w="75" w:type="dxa"/>
+              <w:end w:w="100" w:type="dxa"/>
+            </w:tcMar>
+            <w:vAlign w:val="center"/>
+          </w:tcPr>
+          <w:p>
+            <w:pPr>
+              <w:spacing w:after="0" w:line="259" w:lineRule="auto"/>
+            </w:pPr>
+            <w:r>
+              <w:rPr>
+                <w:rFonts w:ascii="Calibri" w:hAnsi="Calibri" w:eastAsia="Microsoft YaHei"/>
+                <w:b w:val="0"/>
+                <w:color w:val="1F2937"/>
+                <w:sz w:val="14"/>
+              </w:rPr>
+              <w:t>具备批量处理权限的运营管理员</w:t>
+            </w:r>
+          </w:p>
+        </w:tc>
+        <w:tc>
+          <w:tcPr>
+            <w:tcW w:type="dxa" w:w="3024"/>
+            <w:tcMar>
+              <w:top w:w="75" w:type="dxa"/>
+              <w:start w:w="100" w:type="dxa"/>
+              <w:bottom w:w="75" w:type="dxa"/>
+              <w:end w:w="100" w:type="dxa"/>
+            </w:tcMar>
+            <w:vAlign w:val="center"/>
+          </w:tcPr>
+          <w:p>
+            <w:pPr>
+              <w:spacing w:after="0" w:line="259" w:lineRule="auto"/>
+            </w:pPr>
+            <w:r>
+              <w:rPr>
+                <w:rFonts w:ascii="Calibri" w:hAnsi="Calibri" w:eastAsia="Microsoft YaHei"/>
+                <w:b w:val="0"/>
+                <w:color w:val="1F2937"/>
+                <w:sz w:val="14"/>
+              </w:rPr>
+              <w:t>用户登录有效并具备创建或批量权限；关联主数据有效且属于dataScope；页面已加载最新字典、业务配置和allowedActions。</w:t>
+            </w:r>
+          </w:p>
+        </w:tc>
+        <w:tc>
+          <w:tcPr>
+            <w:tcW w:type="dxa" w:w="3168"/>
+            <w:tcMar>
+              <w:top w:w="75" w:type="dxa"/>
+              <w:start w:w="100" w:type="dxa"/>
+              <w:bottom w:w="75" w:type="dxa"/>
+              <w:end w:w="100" w:type="dxa"/>
+            </w:tcMar>
+            <w:vAlign w:val="center"/>
+          </w:tcPr>
+          <w:p>
+            <w:pPr>
+              <w:spacing w:after="0" w:line="259" w:lineRule="auto"/>
+            </w:pPr>
+            <w:r>
+              <w:rPr>
+                <w:rFonts w:ascii="Calibri" w:hAnsi="Calibri" w:eastAsia="Microsoft YaHei"/>
+                <w:b w:val="0"/>
+                <w:color w:val="1F2937"/>
+                <w:sz w:val="14"/>
+              </w:rPr>
+              <w:t>仅可选择待分配或本人有转派权限的记录；指定负责人和团队后逐条校验数据范围并返回成功、失败清单。 成功后刷新version、状态、时间线、关联数量和allowedActions；失败不得提前改变界面主状态。</w:t>
+            </w:r>
+          </w:p>
+        </w:tc>
+      </w:tr>
+      <w:tr>
+        <w:trPr>
+          <w:cantSplit/>
+        </w:trPr>
+        <w:tc>
+          <w:tcPr>
+            <w:tcW w:type="dxa" w:w="1440"/>
+            <w:tcMar>
+              <w:top w:w="75" w:type="dxa"/>
+              <w:start w:w="100" w:type="dxa"/>
+              <w:bottom w:w="75" w:type="dxa"/>
+              <w:end w:w="100" w:type="dxa"/>
+            </w:tcMar>
+            <w:vAlign w:val="center"/>
+            <w:shd w:fill="F4F7FB"/>
+          </w:tcPr>
+          <w:p>
+            <w:pPr>
+              <w:spacing w:after="0" w:line="259" w:lineRule="auto"/>
+            </w:pPr>
+            <w:r>
+              <w:rPr>
+                <w:rFonts w:ascii="Calibri" w:hAnsi="Calibri" w:eastAsia="Microsoft YaHei"/>
+                <w:b w:val="0"/>
+                <w:color w:val="1F2937"/>
+                <w:sz w:val="14"/>
+              </w:rPr>
+              <w:t>OS-OPS-PRD-02-DA04</w:t>
+            </w:r>
+          </w:p>
+        </w:tc>
+        <w:tc>
+          <w:tcPr>
+            <w:tcW w:type="dxa" w:w="1800"/>
+            <w:tcMar>
+              <w:top w:w="75" w:type="dxa"/>
+              <w:start w:w="100" w:type="dxa"/>
+              <w:bottom w:w="75" w:type="dxa"/>
+              <w:end w:w="100" w:type="dxa"/>
+            </w:tcMar>
+            <w:vAlign w:val="center"/>
+            <w:shd w:fill="F4F7FB"/>
+          </w:tcPr>
+          <w:p>
+            <w:pPr>
+              <w:spacing w:after="0" w:line="259" w:lineRule="auto"/>
+            </w:pPr>
+            <w:r>
+              <w:rPr>
+                <w:rFonts w:ascii="Calibri" w:hAnsi="Calibri" w:eastAsia="Microsoft YaHei"/>
+                <w:b w:val="0"/>
+                <w:color w:val="1F2937"/>
+                <w:sz w:val="14"/>
+              </w:rPr>
+              <w:t>跟进线索</w:t>
+            </w:r>
+          </w:p>
+        </w:tc>
+        <w:tc>
+          <w:tcPr>
+            <w:tcW w:type="dxa" w:w="1944"/>
+            <w:tcMar>
+              <w:top w:w="75" w:type="dxa"/>
+              <w:start w:w="100" w:type="dxa"/>
+              <w:bottom w:w="75" w:type="dxa"/>
+              <w:end w:w="100" w:type="dxa"/>
+            </w:tcMar>
+            <w:vAlign w:val="center"/>
+            <w:shd w:fill="F4F7FB"/>
+          </w:tcPr>
+          <w:p>
+            <w:pPr>
+              <w:spacing w:after="0" w:line="259" w:lineRule="auto"/>
+            </w:pPr>
+            <w:r>
+              <w:rPr>
+                <w:rFonts w:ascii="Calibri" w:hAnsi="Calibri" w:eastAsia="Microsoft YaHei"/>
+                <w:b w:val="0"/>
+                <w:color w:val="1F2937"/>
+                <w:sz w:val="14"/>
+              </w:rPr>
+              <w:t>当前对象负责人、被分派执行人或获授权管理员</w:t>
+            </w:r>
+          </w:p>
+        </w:tc>
+        <w:tc>
+          <w:tcPr>
+            <w:tcW w:type="dxa" w:w="3024"/>
+            <w:tcMar>
+              <w:top w:w="75" w:type="dxa"/>
+              <w:start w:w="100" w:type="dxa"/>
+              <w:bottom w:w="75" w:type="dxa"/>
+              <w:end w:w="100" w:type="dxa"/>
+            </w:tcMar>
+            <w:vAlign w:val="center"/>
+            <w:shd w:fill="F4F7FB"/>
+          </w:tcPr>
+          <w:p>
+            <w:pPr>
+              <w:spacing w:after="0" w:line="259" w:lineRule="auto"/>
+            </w:pPr>
+            <w:r>
+              <w:rPr>
+                <w:rFonts w:ascii="Calibri" w:hAnsi="Calibri" w:eastAsia="Microsoft YaHei"/>
+                <w:b w:val="0"/>
+                <w:color w:val="1F2937"/>
+                <w:sz w:val="14"/>
+              </w:rPr>
+              <w:t>用户登录有效；目标对象存在且属于用户dataScope；当前状态包含该动作；页面持有最新version和allowedActions。涉及金额、库存、附件或第三方结果时必须回源确认。</w:t>
+            </w:r>
+          </w:p>
+        </w:tc>
+        <w:tc>
+          <w:tcPr>
+            <w:tcW w:type="dxa" w:w="3168"/>
+            <w:tcMar>
+              <w:top w:w="75" w:type="dxa"/>
+              <w:start w:w="100" w:type="dxa"/>
+              <w:bottom w:w="75" w:type="dxa"/>
+              <w:end w:w="100" w:type="dxa"/>
+            </w:tcMar>
+            <w:vAlign w:val="center"/>
+            <w:shd w:fill="F4F7FB"/>
+          </w:tcPr>
+          <w:p>
+            <w:pPr>
+              <w:spacing w:after="0" w:line="259" w:lineRule="auto"/>
+            </w:pPr>
+            <w:r>
+              <w:rPr>
+                <w:rFonts w:ascii="Calibri" w:hAnsi="Calibri" w:eastAsia="Microsoft YaHei"/>
+                <w:b w:val="0"/>
+                <w:color w:val="1F2937"/>
+                <w:sz w:val="14"/>
+              </w:rPr>
+              <w:t>记录沟通方式、联系结果、意向、阶段、负责人、下一步动作、沟通纪要和下次跟进时间。 成功后刷新version、状态、时间线、关联数量和allowedActions；失败不得提前改变界面主状态。</w:t>
+            </w:r>
+          </w:p>
+        </w:tc>
+      </w:tr>
+      <w:tr>
+        <w:trPr>
+          <w:cantSplit/>
+        </w:trPr>
+        <w:tc>
+          <w:tcPr>
+            <w:tcW w:type="dxa" w:w="1440"/>
+            <w:tcMar>
+              <w:top w:w="75" w:type="dxa"/>
+              <w:start w:w="100" w:type="dxa"/>
+              <w:bottom w:w="75" w:type="dxa"/>
+              <w:end w:w="100" w:type="dxa"/>
+            </w:tcMar>
+            <w:vAlign w:val="center"/>
+          </w:tcPr>
+          <w:p>
+            <w:pPr>
+              <w:spacing w:after="0" w:line="259" w:lineRule="auto"/>
+            </w:pPr>
+            <w:r>
+              <w:rPr>
+                <w:rFonts w:ascii="Calibri" w:hAnsi="Calibri" w:eastAsia="Microsoft YaHei"/>
+                <w:b w:val="0"/>
+                <w:color w:val="1F2937"/>
+                <w:sz w:val="14"/>
+              </w:rPr>
+              <w:t>OS-OPS-PRD-02-DA05</w:t>
+            </w:r>
+          </w:p>
+        </w:tc>
+        <w:tc>
+          <w:tcPr>
+            <w:tcW w:type="dxa" w:w="1800"/>
+            <w:tcMar>
+              <w:top w:w="75" w:type="dxa"/>
+              <w:start w:w="100" w:type="dxa"/>
+              <w:bottom w:w="75" w:type="dxa"/>
+              <w:end w:w="100" w:type="dxa"/>
+            </w:tcMar>
+            <w:vAlign w:val="center"/>
+          </w:tcPr>
+          <w:p>
+            <w:pPr>
+              <w:spacing w:after="0" w:line="259" w:lineRule="auto"/>
+            </w:pPr>
+            <w:r>
+              <w:rPr>
+                <w:rFonts w:ascii="Calibri" w:hAnsi="Calibri" w:eastAsia="Microsoft YaHei"/>
+                <w:b w:val="0"/>
+                <w:color w:val="1F2937"/>
+                <w:sz w:val="14"/>
+              </w:rPr>
+              <w:t>生成跟进任务</w:t>
+            </w:r>
+          </w:p>
+        </w:tc>
+        <w:tc>
+          <w:tcPr>
+            <w:tcW w:type="dxa" w:w="1944"/>
+            <w:tcMar>
+              <w:top w:w="75" w:type="dxa"/>
+              <w:start w:w="100" w:type="dxa"/>
+              <w:bottom w:w="75" w:type="dxa"/>
+              <w:end w:w="100" w:type="dxa"/>
+            </w:tcMar>
+            <w:vAlign w:val="center"/>
+          </w:tcPr>
+          <w:p>
+            <w:pPr>
+              <w:spacing w:after="0" w:line="259" w:lineRule="auto"/>
+            </w:pPr>
+            <w:r>
+              <w:rPr>
+                <w:rFonts w:ascii="Calibri" w:hAnsi="Calibri" w:eastAsia="Microsoft YaHei"/>
+                <w:b w:val="0"/>
+                <w:color w:val="1F2937"/>
+                <w:sz w:val="14"/>
+              </w:rPr>
+              <w:t>具备本模块创建权限的运营人员</w:t>
+            </w:r>
+          </w:p>
+        </w:tc>
+        <w:tc>
+          <w:tcPr>
+            <w:tcW w:type="dxa" w:w="3024"/>
+            <w:tcMar>
+              <w:top w:w="75" w:type="dxa"/>
+              <w:start w:w="100" w:type="dxa"/>
+              <w:bottom w:w="75" w:type="dxa"/>
+              <w:end w:w="100" w:type="dxa"/>
+            </w:tcMar>
+            <w:vAlign w:val="center"/>
+          </w:tcPr>
+          <w:p>
+            <w:pPr>
+              <w:spacing w:after="0" w:line="259" w:lineRule="auto"/>
+            </w:pPr>
+            <w:r>
+              <w:rPr>
+                <w:rFonts w:ascii="Calibri" w:hAnsi="Calibri" w:eastAsia="Microsoft YaHei"/>
+                <w:b w:val="0"/>
+                <w:color w:val="1F2937"/>
+                <w:sz w:val="14"/>
+              </w:rPr>
+              <w:t>用户登录有效并具备创建或批量权限；关联主数据有效且属于dataScope；页面已加载最新字典、业务配置和allowedActions。</w:t>
+            </w:r>
+          </w:p>
+        </w:tc>
+        <w:tc>
+          <w:tcPr>
+            <w:tcW w:type="dxa" w:w="3168"/>
+            <w:tcMar>
+              <w:top w:w="75" w:type="dxa"/>
+              <w:start w:w="100" w:type="dxa"/>
+              <w:bottom w:w="75" w:type="dxa"/>
+              <w:end w:w="100" w:type="dxa"/>
+            </w:tcMar>
+            <w:vAlign w:val="center"/>
+          </w:tcPr>
+          <w:p>
+            <w:pPr>
+              <w:spacing w:after="0" w:line="259" w:lineRule="auto"/>
+            </w:pPr>
+            <w:r>
+              <w:rPr>
+                <w:rFonts w:ascii="Calibri" w:hAnsi="Calibri" w:eastAsia="Microsoft YaHei"/>
+                <w:b w:val="0"/>
+                <w:color w:val="1F2937"/>
+                <w:sz w:val="14"/>
+              </w:rPr>
+              <w:t>勾选后创建任务并回写下一步任务；重复提交不得生成重复任务。 成功后刷新version、状态、时间线、关联数量和allowedActions；失败不得提前改变界面主状态。</w:t>
+            </w:r>
+          </w:p>
+        </w:tc>
+      </w:tr>
+      <w:tr>
+        <w:trPr>
+          <w:cantSplit/>
+        </w:trPr>
+        <w:tc>
+          <w:tcPr>
+            <w:tcW w:type="dxa" w:w="1440"/>
+            <w:tcMar>
+              <w:top w:w="75" w:type="dxa"/>
+              <w:start w:w="100" w:type="dxa"/>
+              <w:bottom w:w="75" w:type="dxa"/>
+              <w:end w:w="100" w:type="dxa"/>
+            </w:tcMar>
+            <w:vAlign w:val="center"/>
+            <w:shd w:fill="F4F7FB"/>
+          </w:tcPr>
+          <w:p>
+            <w:pPr>
+              <w:spacing w:after="0" w:line="259" w:lineRule="auto"/>
+            </w:pPr>
+            <w:r>
+              <w:rPr>
+                <w:rFonts w:ascii="Calibri" w:hAnsi="Calibri" w:eastAsia="Microsoft YaHei"/>
+                <w:b w:val="0"/>
+                <w:color w:val="1F2937"/>
+                <w:sz w:val="14"/>
+              </w:rPr>
+              <w:t>OS-OPS-PRD-02-DA06</w:t>
+            </w:r>
+          </w:p>
+        </w:tc>
+        <w:tc>
+          <w:tcPr>
+            <w:tcW w:type="dxa" w:w="1800"/>
+            <w:tcMar>
+              <w:top w:w="75" w:type="dxa"/>
+              <w:start w:w="100" w:type="dxa"/>
+              <w:bottom w:w="75" w:type="dxa"/>
+              <w:end w:w="100" w:type="dxa"/>
+            </w:tcMar>
+            <w:vAlign w:val="center"/>
+            <w:shd w:fill="F4F7FB"/>
+          </w:tcPr>
+          <w:p>
+            <w:pPr>
+              <w:spacing w:after="0" w:line="259" w:lineRule="auto"/>
+            </w:pPr>
+            <w:r>
+              <w:rPr>
+                <w:rFonts w:ascii="Calibri" w:hAnsi="Calibri" w:eastAsia="Microsoft YaHei"/>
+                <w:b w:val="0"/>
+                <w:color w:val="1F2937"/>
+                <w:sz w:val="14"/>
+              </w:rPr>
+              <w:t>转预约</w:t>
+            </w:r>
+          </w:p>
+        </w:tc>
+        <w:tc>
+          <w:tcPr>
+            <w:tcW w:type="dxa" w:w="1944"/>
+            <w:tcMar>
+              <w:top w:w="75" w:type="dxa"/>
+              <w:start w:w="100" w:type="dxa"/>
+              <w:bottom w:w="75" w:type="dxa"/>
+              <w:end w:w="100" w:type="dxa"/>
+            </w:tcMar>
+            <w:vAlign w:val="center"/>
+            <w:shd w:fill="F4F7FB"/>
+          </w:tcPr>
+          <w:p>
+            <w:pPr>
+              <w:spacing w:after="0" w:line="259" w:lineRule="auto"/>
+            </w:pPr>
+            <w:r>
+              <w:rPr>
+                <w:rFonts w:ascii="Calibri" w:hAnsi="Calibri" w:eastAsia="Microsoft YaHei"/>
+                <w:b w:val="0"/>
+                <w:color w:val="1F2937"/>
+                <w:sz w:val="14"/>
+              </w:rPr>
+              <w:t>当前对象负责人、被分派执行人或获授权管理员</w:t>
+            </w:r>
+          </w:p>
+        </w:tc>
+        <w:tc>
+          <w:tcPr>
+            <w:tcW w:type="dxa" w:w="3024"/>
+            <w:tcMar>
+              <w:top w:w="75" w:type="dxa"/>
+              <w:start w:w="100" w:type="dxa"/>
+              <w:bottom w:w="75" w:type="dxa"/>
+              <w:end w:w="100" w:type="dxa"/>
+            </w:tcMar>
+            <w:vAlign w:val="center"/>
+            <w:shd w:fill="F4F7FB"/>
+          </w:tcPr>
+          <w:p>
+            <w:pPr>
+              <w:spacing w:after="0" w:line="259" w:lineRule="auto"/>
+            </w:pPr>
+            <w:r>
+              <w:rPr>
+                <w:rFonts w:ascii="Calibri" w:hAnsi="Calibri" w:eastAsia="Microsoft YaHei"/>
+                <w:b w:val="0"/>
+                <w:color w:val="1F2937"/>
+                <w:sz w:val="14"/>
+              </w:rPr>
+              <w:t>用户登录有效；目标对象存在且属于用户dataScope；当前状态包含该动作；页面持有最新version和allowedActions。涉及金额、库存、附件或第三方结果时必须回源确认。</w:t>
+            </w:r>
+          </w:p>
+        </w:tc>
+        <w:tc>
+          <w:tcPr>
+            <w:tcW w:type="dxa" w:w="3168"/>
+            <w:tcMar>
+              <w:top w:w="75" w:type="dxa"/>
+              <w:start w:w="100" w:type="dxa"/>
+              <w:bottom w:w="75" w:type="dxa"/>
+              <w:end w:w="100" w:type="dxa"/>
+            </w:tcMar>
+            <w:vAlign w:val="center"/>
+            <w:shd w:fill="F4F7FB"/>
+          </w:tcPr>
+          <w:p>
+            <w:pPr>
+              <w:spacing w:after="0" w:line="259" w:lineRule="auto"/>
+            </w:pPr>
+            <w:r>
+              <w:rPr>
+                <w:rFonts w:ascii="Calibri" w:hAnsi="Calibri" w:eastAsia="Microsoft YaHei"/>
+                <w:b w:val="0"/>
+                <w:color w:val="1F2937"/>
+                <w:sz w:val="14"/>
+              </w:rPr>
+              <w:t>需有客户、电话、意向地区和预约类型；生成 AP 编号并在原线索保留关联关系。 成功后刷新version、状态、时间线、关联数量和allowedActions；失败不得提前改变界面主状态。</w:t>
+            </w:r>
+          </w:p>
+        </w:tc>
+      </w:tr>
+      <w:tr>
+        <w:trPr>
+          <w:cantSplit/>
+        </w:trPr>
+        <w:tc>
+          <w:tcPr>
+            <w:tcW w:type="dxa" w:w="1440"/>
+            <w:tcMar>
+              <w:top w:w="75" w:type="dxa"/>
+              <w:start w:w="100" w:type="dxa"/>
+              <w:bottom w:w="75" w:type="dxa"/>
+              <w:end w:w="100" w:type="dxa"/>
+            </w:tcMar>
+            <w:vAlign w:val="center"/>
+          </w:tcPr>
+          <w:p>
+            <w:pPr>
+              <w:spacing w:after="0" w:line="259" w:lineRule="auto"/>
+            </w:pPr>
+            <w:r>
+              <w:rPr>
+                <w:rFonts w:ascii="Calibri" w:hAnsi="Calibri" w:eastAsia="Microsoft YaHei"/>
+                <w:b w:val="0"/>
+                <w:color w:val="1F2937"/>
+                <w:sz w:val="14"/>
+              </w:rPr>
+              <w:t>OS-OPS-PRD-02-DA07</w:t>
+            </w:r>
+          </w:p>
+        </w:tc>
+        <w:tc>
+          <w:tcPr>
+            <w:tcW w:type="dxa" w:w="1800"/>
+            <w:tcMar>
+              <w:top w:w="75" w:type="dxa"/>
+              <w:start w:w="100" w:type="dxa"/>
+              <w:bottom w:w="75" w:type="dxa"/>
+              <w:end w:w="100" w:type="dxa"/>
+            </w:tcMar>
+            <w:vAlign w:val="center"/>
+          </w:tcPr>
+          <w:p>
+            <w:pPr>
+              <w:spacing w:after="0" w:line="259" w:lineRule="auto"/>
+            </w:pPr>
+            <w:r>
+              <w:rPr>
+                <w:rFonts w:ascii="Calibri" w:hAnsi="Calibri" w:eastAsia="Microsoft YaHei"/>
+                <w:b w:val="0"/>
+                <w:color w:val="1F2937"/>
+                <w:sz w:val="14"/>
+              </w:rPr>
+              <w:t>转销售机会</w:t>
+            </w:r>
+          </w:p>
+        </w:tc>
+        <w:tc>
+          <w:tcPr>
+            <w:tcW w:type="dxa" w:w="1944"/>
+            <w:tcMar>
+              <w:top w:w="75" w:type="dxa"/>
+              <w:start w:w="100" w:type="dxa"/>
+              <w:bottom w:w="75" w:type="dxa"/>
+              <w:end w:w="100" w:type="dxa"/>
+            </w:tcMar>
+            <w:vAlign w:val="center"/>
+          </w:tcPr>
+          <w:p>
+            <w:pPr>
+              <w:spacing w:after="0" w:line="259" w:lineRule="auto"/>
+            </w:pPr>
+            <w:r>
+              <w:rPr>
+                <w:rFonts w:ascii="Calibri" w:hAnsi="Calibri" w:eastAsia="Microsoft YaHei"/>
+                <w:b w:val="0"/>
+                <w:color w:val="1F2937"/>
+                <w:sz w:val="14"/>
+              </w:rPr>
+              <w:t>当前对象负责人、被分派执行人或获授权管理员</w:t>
+            </w:r>
+          </w:p>
+        </w:tc>
+        <w:tc>
+          <w:tcPr>
+            <w:tcW w:type="dxa" w:w="3024"/>
+            <w:tcMar>
+              <w:top w:w="75" w:type="dxa"/>
+              <w:start w:w="100" w:type="dxa"/>
+              <w:bottom w:w="75" w:type="dxa"/>
+              <w:end w:w="100" w:type="dxa"/>
+            </w:tcMar>
+            <w:vAlign w:val="center"/>
+          </w:tcPr>
+          <w:p>
+            <w:pPr>
+              <w:spacing w:after="0" w:line="259" w:lineRule="auto"/>
+            </w:pPr>
+            <w:r>
+              <w:rPr>
+                <w:rFonts w:ascii="Calibri" w:hAnsi="Calibri" w:eastAsia="Microsoft YaHei"/>
+                <w:b w:val="0"/>
+                <w:color w:val="1F2937"/>
+                <w:sz w:val="14"/>
+              </w:rPr>
+              <w:t>用户登录有效；目标对象存在且属于用户dataScope；当前状态包含该动作；页面持有最新version和allowedActions。涉及金额、库存、附件或第三方结果时必须回源确认。</w:t>
+            </w:r>
+          </w:p>
+        </w:tc>
+        <w:tc>
+          <w:tcPr>
+            <w:tcW w:type="dxa" w:w="3168"/>
+            <w:tcMar>
+              <w:top w:w="75" w:type="dxa"/>
+              <w:start w:w="100" w:type="dxa"/>
+              <w:bottom w:w="75" w:type="dxa"/>
+              <w:end w:w="100" w:type="dxa"/>
+            </w:tcMar>
+            <w:vAlign w:val="center"/>
+          </w:tcPr>
+          <w:p>
+            <w:pPr>
+              <w:spacing w:after="0" w:line="259" w:lineRule="auto"/>
+            </w:pPr>
+            <w:r>
+              <w:rPr>
+                <w:rFonts w:ascii="Calibri" w:hAnsi="Calibri" w:eastAsia="Microsoft YaHei"/>
+                <w:b w:val="0"/>
+                <w:color w:val="1F2937"/>
+                <w:sz w:val="14"/>
+              </w:rPr>
+              <w:t>完成资格确认后生成 OP 编号，继承客户、需求、预算、来源、负责人和沟通摘要。 成功后刷新version、状态、时间线、关联数量和allowedActions；失败不得提前改变界面主状态。</w:t>
+            </w:r>
+          </w:p>
+        </w:tc>
+      </w:tr>
+      <w:tr>
+        <w:trPr>
+          <w:cantSplit/>
+        </w:trPr>
+        <w:tc>
+          <w:tcPr>
+            <w:tcW w:type="dxa" w:w="1440"/>
+            <w:tcMar>
+              <w:top w:w="75" w:type="dxa"/>
+              <w:start w:w="100" w:type="dxa"/>
+              <w:bottom w:w="75" w:type="dxa"/>
+              <w:end w:w="100" w:type="dxa"/>
+            </w:tcMar>
+            <w:vAlign w:val="center"/>
+            <w:shd w:fill="F4F7FB"/>
+          </w:tcPr>
+          <w:p>
+            <w:pPr>
+              <w:spacing w:after="0" w:line="259" w:lineRule="auto"/>
+            </w:pPr>
+            <w:r>
+              <w:rPr>
+                <w:rFonts w:ascii="Calibri" w:hAnsi="Calibri" w:eastAsia="Microsoft YaHei"/>
+                <w:b w:val="0"/>
+                <w:color w:val="1F2937"/>
+                <w:sz w:val="14"/>
+              </w:rPr>
+              <w:t>OS-OPS-PRD-02-DA08</w:t>
+            </w:r>
+          </w:p>
+        </w:tc>
+        <w:tc>
+          <w:tcPr>
+            <w:tcW w:type="dxa" w:w="1800"/>
+            <w:tcMar>
+              <w:top w:w="75" w:type="dxa"/>
+              <w:start w:w="100" w:type="dxa"/>
+              <w:bottom w:w="75" w:type="dxa"/>
+              <w:end w:w="100" w:type="dxa"/>
+            </w:tcMar>
+            <w:vAlign w:val="center"/>
+            <w:shd w:fill="F4F7FB"/>
+          </w:tcPr>
+          <w:p>
+            <w:pPr>
+              <w:spacing w:after="0" w:line="259" w:lineRule="auto"/>
+            </w:pPr>
+            <w:r>
+              <w:rPr>
+                <w:rFonts w:ascii="Calibri" w:hAnsi="Calibri" w:eastAsia="Microsoft YaHei"/>
+                <w:b w:val="0"/>
+                <w:color w:val="1F2937"/>
+                <w:sz w:val="14"/>
+              </w:rPr>
+              <w:t>标记无效</w:t>
+            </w:r>
+          </w:p>
+        </w:tc>
+        <w:tc>
+          <w:tcPr>
+            <w:tcW w:type="dxa" w:w="1944"/>
+            <w:tcMar>
+              <w:top w:w="75" w:type="dxa"/>
+              <w:start w:w="100" w:type="dxa"/>
+              <w:bottom w:w="75" w:type="dxa"/>
+              <w:end w:w="100" w:type="dxa"/>
+            </w:tcMar>
+            <w:vAlign w:val="center"/>
+            <w:shd w:fill="F4F7FB"/>
+          </w:tcPr>
+          <w:p>
+            <w:pPr>
+              <w:spacing w:after="0" w:line="259" w:lineRule="auto"/>
+            </w:pPr>
+            <w:r>
+              <w:rPr>
+                <w:rFonts w:ascii="Calibri" w:hAnsi="Calibri" w:eastAsia="Microsoft YaHei"/>
+                <w:b w:val="0"/>
+                <w:color w:val="1F2937"/>
+                <w:sz w:val="14"/>
+              </w:rPr>
+              <w:t>当前对象负责人、被分派执行人或获授权管理员</w:t>
+            </w:r>
+          </w:p>
+        </w:tc>
+        <w:tc>
+          <w:tcPr>
+            <w:tcW w:type="dxa" w:w="3024"/>
+            <w:tcMar>
+              <w:top w:w="75" w:type="dxa"/>
+              <w:start w:w="100" w:type="dxa"/>
+              <w:bottom w:w="75" w:type="dxa"/>
+              <w:end w:w="100" w:type="dxa"/>
+            </w:tcMar>
+            <w:vAlign w:val="center"/>
+            <w:shd w:fill="F4F7FB"/>
+          </w:tcPr>
+          <w:p>
+            <w:pPr>
+              <w:spacing w:after="0" w:line="259" w:lineRule="auto"/>
+            </w:pPr>
+            <w:r>
+              <w:rPr>
+                <w:rFonts w:ascii="Calibri" w:hAnsi="Calibri" w:eastAsia="Microsoft YaHei"/>
+                <w:b w:val="0"/>
+                <w:color w:val="1F2937"/>
+                <w:sz w:val="14"/>
+              </w:rPr>
+              <w:t>用户登录有效；目标对象存在且属于用户dataScope；当前状态包含该动作；页面持有最新version和allowedActions。涉及金额、库存、附件或第三方结果时必须回源确认。</w:t>
+            </w:r>
+          </w:p>
+        </w:tc>
+        <w:tc>
+          <w:tcPr>
+            <w:tcW w:type="dxa" w:w="3168"/>
+            <w:tcMar>
+              <w:top w:w="75" w:type="dxa"/>
+              <w:start w:w="100" w:type="dxa"/>
+              <w:bottom w:w="75" w:type="dxa"/>
+              <w:end w:w="100" w:type="dxa"/>
+            </w:tcMar>
+            <w:vAlign w:val="center"/>
+            <w:shd w:fill="F4F7FB"/>
+          </w:tcPr>
+          <w:p>
+            <w:pPr>
+              <w:spacing w:after="0" w:line="259" w:lineRule="auto"/>
+            </w:pPr>
+            <w:r>
+              <w:rPr>
+                <w:rFonts w:ascii="Calibri" w:hAnsi="Calibri" w:eastAsia="Microsoft YaHei"/>
+                <w:b w:val="0"/>
+                <w:color w:val="1F2937"/>
+                <w:sz w:val="14"/>
+              </w:rPr>
+              <w:t>必须选择无效原因；关闭未完成任务，保留历史，不允许物理删除已产生转化记录的线索。 成功后刷新version、状态、时间线、关联数量和allowedActions；失败不得提前改变界面主状态。</w:t>
+            </w:r>
+          </w:p>
+        </w:tc>
+      </w:tr>
+      <w:tr>
+        <w:trPr>
+          <w:cantSplit/>
+        </w:trPr>
+        <w:tc>
+          <w:tcPr>
+            <w:tcW w:type="dxa" w:w="1440"/>
+            <w:tcMar>
+              <w:top w:w="75" w:type="dxa"/>
+              <w:start w:w="100" w:type="dxa"/>
+              <w:bottom w:w="75" w:type="dxa"/>
+              <w:end w:w="100" w:type="dxa"/>
+            </w:tcMar>
+            <w:vAlign w:val="center"/>
+          </w:tcPr>
+          <w:p>
+            <w:pPr>
+              <w:spacing w:after="0" w:line="259" w:lineRule="auto"/>
+            </w:pPr>
+            <w:r>
+              <w:rPr>
+                <w:rFonts w:ascii="Calibri" w:hAnsi="Calibri" w:eastAsia="Microsoft YaHei"/>
+                <w:b w:val="0"/>
+                <w:color w:val="1F2937"/>
+                <w:sz w:val="14"/>
+              </w:rPr>
+              <w:t>OS-OPS-PRD-02-DA09</w:t>
+            </w:r>
+          </w:p>
+        </w:tc>
+        <w:tc>
+          <w:tcPr>
+            <w:tcW w:type="dxa" w:w="1800"/>
+            <w:tcMar>
+              <w:top w:w="75" w:type="dxa"/>
+              <w:start w:w="100" w:type="dxa"/>
+              <w:bottom w:w="75" w:type="dxa"/>
+              <w:end w:w="100" w:type="dxa"/>
+            </w:tcMar>
+            <w:vAlign w:val="center"/>
+          </w:tcPr>
+          <w:p>
+            <w:pPr>
+              <w:spacing w:after="0" w:line="259" w:lineRule="auto"/>
+            </w:pPr>
+            <w:r>
+              <w:rPr>
+                <w:rFonts w:ascii="Calibri" w:hAnsi="Calibri" w:eastAsia="Microsoft YaHei"/>
+                <w:b w:val="0"/>
+                <w:color w:val="1F2937"/>
+                <w:sz w:val="14"/>
+              </w:rPr>
+              <w:t>导出</w:t>
+            </w:r>
+          </w:p>
+        </w:tc>
+        <w:tc>
+          <w:tcPr>
+            <w:tcW w:type="dxa" w:w="1944"/>
+            <w:tcMar>
+              <w:top w:w="75" w:type="dxa"/>
+              <w:start w:w="100" w:type="dxa"/>
+              <w:bottom w:w="75" w:type="dxa"/>
+              <w:end w:w="100" w:type="dxa"/>
+            </w:tcMar>
+            <w:vAlign w:val="center"/>
+          </w:tcPr>
+          <w:p>
+            <w:pPr>
+              <w:spacing w:after="0" w:line="259" w:lineRule="auto"/>
+            </w:pPr>
+            <w:r>
+              <w:rPr>
+                <w:rFonts w:ascii="Calibri" w:hAnsi="Calibri" w:eastAsia="Microsoft YaHei"/>
+                <w:b w:val="0"/>
+                <w:color w:val="1F2937"/>
+                <w:sz w:val="14"/>
+              </w:rPr>
+              <w:t>具备导出或报告权限的用户</w:t>
+            </w:r>
+          </w:p>
+        </w:tc>
+        <w:tc>
+          <w:tcPr>
+            <w:tcW w:type="dxa" w:w="3024"/>
+            <w:tcMar>
+              <w:top w:w="75" w:type="dxa"/>
+              <w:start w:w="100" w:type="dxa"/>
+              <w:bottom w:w="75" w:type="dxa"/>
+              <w:end w:w="100" w:type="dxa"/>
+            </w:tcMar>
+            <w:vAlign w:val="center"/>
+          </w:tcPr>
+          <w:p>
+            <w:pPr>
+              <w:spacing w:after="0" w:line="259" w:lineRule="auto"/>
+            </w:pPr>
+            <w:r>
+              <w:rPr>
+                <w:rFonts w:ascii="Calibri" w:hAnsi="Calibri" w:eastAsia="Microsoft YaHei"/>
+                <w:b w:val="0"/>
+                <w:color w:val="1F2937"/>
+                <w:sz w:val="14"/>
+              </w:rPr>
+              <w:t>用户具备导出或报告权限，当前查询已完成且筛选合法；导出列不得超出字段权限，任务配额未超限。</w:t>
+            </w:r>
+          </w:p>
+        </w:tc>
+        <w:tc>
+          <w:tcPr>
+            <w:tcW w:type="dxa" w:w="3168"/>
+            <w:tcMar>
+              <w:top w:w="75" w:type="dxa"/>
+              <w:start w:w="100" w:type="dxa"/>
+              <w:bottom w:w="75" w:type="dxa"/>
+              <w:end w:w="100" w:type="dxa"/>
+            </w:tcMar>
+            <w:vAlign w:val="center"/>
+          </w:tcPr>
+          <w:p>
+            <w:pPr>
+              <w:spacing w:after="0" w:line="259" w:lineRule="auto"/>
+            </w:pPr>
+            <w:r>
+              <w:rPr>
+                <w:rFonts w:ascii="Calibri" w:hAnsi="Calibri" w:eastAsia="Microsoft YaHei"/>
+                <w:b w:val="0"/>
+                <w:color w:val="1F2937"/>
+                <w:sz w:val="14"/>
+              </w:rPr>
+              <w:t>继承当前筛选和数据范围；手机号、邮箱、HKID按导出权限脱敏。 成功后刷新version、状态、时间线、关联数量和allowedActions；失败不得提前改变界面主状态。</w:t>
+            </w:r>
+          </w:p>
+        </w:tc>
+      </w:tr>
+    </w:tbl>
+    <w:p>
+      <w:pPr>
+        <w:spacing w:after="0"/>
+      </w:pPr>
+    </w:p>
+    <w:p>
+      <w:pPr>
+        <w:pStyle w:val="ListBullet"/>
+      </w:pPr>
+      <w:r>
+        <w:t>主动作与次动作严格按照allowedActions显示并固定actionCode映射</w:t>
+      </w:r>
+    </w:p>
+    <w:p>
+      <w:pPr>
+        <w:pStyle w:val="ListBullet"/>
+      </w:pPr>
+      <w:r>
+        <w:t>破坏性、资金、权限、发布、作废和关闭动作必须二次确认并显示影响范围</w:t>
+      </w:r>
+    </w:p>
+    <w:p>
+      <w:pPr>
+        <w:pStyle w:val="ListBullet"/>
+      </w:pPr>
+      <w:r>
+        <w:t>提交携带id、expectedVersion和clientRequestId，服务端重复校验角色、数据范围、状态及业务前置</w:t>
+      </w:r>
+    </w:p>
+    <w:p>
+      <w:pPr>
+        <w:pStyle w:val="ListBullet"/>
+      </w:pPr>
+      <w:r>
+        <w:t>动作超时先用clientRequestId查询结果，禁止直接重复扣款、发券、发通知、发布或迁移</w:t>
+      </w:r>
+    </w:p>
+    <w:p>
+      <w:pPr>
+        <w:pStyle w:val="ListBullet"/>
+      </w:pPr>
+      <w:r>
+        <w:t>批量或部分成功必须返回逐项结果、失败原因和补偿入口</w:t>
+      </w:r>
+    </w:p>
+    <w:p>
+      <w:pPr>
+        <w:pStyle w:val="Heading2"/>
+      </w:pPr>
+      <w:r>
+        <w:t>5.8 详情接口数据与事件</w:t>
+      </w:r>
+    </w:p>
+    <w:tbl>
+      <w:tblPr>
+        <w:tblStyle w:val="TableGrid"/>
+        <w:tblW w:type="dxa" w:w="10224"/>
+        <w:jc w:val="center"/>
+        <w:tblLayout w:type="fixed"/>
+        <w:tblLook w:firstColumn="1" w:firstRow="1" w:lastColumn="0" w:lastRow="0" w:noHBand="0" w:noVBand="1" w:val="04A0"/>
+      </w:tblPr>
+      <w:tblGrid>
+        <w:gridCol w:w="1800"/>
+        <w:gridCol w:w="3960"/>
+        <w:gridCol w:w="4464"/>
+      </w:tblGrid>
+      <w:tr>
+        <w:trPr>
+          <w:tblHeader/>
+        </w:trPr>
+        <w:tc>
+          <w:tcPr>
+            <w:tcW w:type="dxa" w:w="1800"/>
+            <w:shd w:fill="17365D"/>
+            <w:tcMar>
+              <w:top w:w="75" w:type="dxa"/>
+              <w:start w:w="100" w:type="dxa"/>
+              <w:bottom w:w="75" w:type="dxa"/>
+              <w:end w:w="100" w:type="dxa"/>
+            </w:tcMar>
+            <w:vAlign w:val="center"/>
+          </w:tcPr>
+          <w:p>
+            <w:r>
+              <w:rPr>
+                <w:rFonts w:ascii="Calibri" w:hAnsi="Calibri" w:eastAsia="Microsoft YaHei"/>
+                <w:b/>
+                <w:color w:val="FFFFFF"/>
+                <w:sz w:val="15"/>
+              </w:rPr>
+              <w:t>契约</w:t>
+            </w:r>
+          </w:p>
+        </w:tc>
+        <w:tc>
+          <w:tcPr>
+            <w:tcW w:type="dxa" w:w="3960"/>
+            <w:shd w:fill="17365D"/>
+            <w:tcMar>
+              <w:top w:w="75" w:type="dxa"/>
+              <w:start w:w="100" w:type="dxa"/>
+              <w:bottom w:w="75" w:type="dxa"/>
+              <w:end w:w="100" w:type="dxa"/>
+            </w:tcMar>
+            <w:vAlign w:val="center"/>
+          </w:tcPr>
+          <w:p>
+            <w:r>
+              <w:rPr>
+                <w:rFonts w:ascii="Calibri" w:hAnsi="Calibri" w:eastAsia="Microsoft YaHei"/>
+                <w:b/>
+                <w:color w:val="FFFFFF"/>
+                <w:sz w:val="15"/>
+              </w:rPr>
+              <w:t>路径或事件</w:t>
+            </w:r>
+          </w:p>
+        </w:tc>
+        <w:tc>
+          <w:tcPr>
+            <w:tcW w:type="dxa" w:w="4464"/>
+            <w:shd w:fill="17365D"/>
+            <w:tcMar>
+              <w:top w:w="75" w:type="dxa"/>
+              <w:start w:w="100" w:type="dxa"/>
+              <w:bottom w:w="75" w:type="dxa"/>
+              <w:end w:w="100" w:type="dxa"/>
+            </w:tcMar>
+            <w:vAlign w:val="center"/>
+          </w:tcPr>
+          <w:p>
+            <w:r>
+              <w:rPr>
+                <w:rFonts w:ascii="Calibri" w:hAnsi="Calibri" w:eastAsia="Microsoft YaHei"/>
+                <w:b/>
+                <w:color w:val="FFFFFF"/>
+                <w:sz w:val="15"/>
+              </w:rPr>
+              <w:t>开发要求</w:t>
+            </w:r>
+          </w:p>
+        </w:tc>
+      </w:tr>
+      <w:tr>
+        <w:trPr>
+          <w:cantSplit/>
+        </w:trPr>
+        <w:tc>
+          <w:tcPr>
+            <w:tcW w:type="dxa" w:w="1800"/>
+            <w:tcMar>
+              <w:top w:w="75" w:type="dxa"/>
+              <w:start w:w="100" w:type="dxa"/>
+              <w:bottom w:w="75" w:type="dxa"/>
+              <w:end w:w="100" w:type="dxa"/>
+            </w:tcMar>
+            <w:vAlign w:val="center"/>
+          </w:tcPr>
+          <w:p>
+            <w:pPr>
+              <w:spacing w:after="0" w:line="259" w:lineRule="auto"/>
+            </w:pPr>
+            <w:r>
+              <w:rPr>
+                <w:rFonts w:ascii="Calibri" w:hAnsi="Calibri" w:eastAsia="Microsoft YaHei"/>
+                <w:b w:val="0"/>
+                <w:color w:val="1F2937"/>
+                <w:sz w:val="15"/>
+              </w:rPr>
+              <w:t>详情聚合</w:t>
+            </w:r>
+          </w:p>
+        </w:tc>
+        <w:tc>
+          <w:tcPr>
+            <w:tcW w:type="dxa" w:w="3960"/>
+            <w:tcMar>
+              <w:top w:w="75" w:type="dxa"/>
+              <w:start w:w="100" w:type="dxa"/>
+              <w:bottom w:w="75" w:type="dxa"/>
+              <w:end w:w="100" w:type="dxa"/>
+            </w:tcMar>
+            <w:vAlign w:val="center"/>
+          </w:tcPr>
+          <w:p>
+            <w:pPr>
+              <w:spacing w:after="0" w:line="259" w:lineRule="auto"/>
+            </w:pPr>
+            <w:r>
+              <w:rPr>
+                <w:rFonts w:ascii="Calibri" w:hAnsi="Calibri" w:eastAsia="Microsoft YaHei"/>
+                <w:b w:val="0"/>
+                <w:color w:val="1F2937"/>
+                <w:sz w:val="15"/>
+              </w:rPr>
+              <w:t>GET /ops/v1/leads/{id}</w:t>
+            </w:r>
+          </w:p>
+        </w:tc>
+        <w:tc>
+          <w:tcPr>
+            <w:tcW w:type="dxa" w:w="4464"/>
+            <w:tcMar>
+              <w:top w:w="75" w:type="dxa"/>
+              <w:start w:w="100" w:type="dxa"/>
+              <w:bottom w:w="75" w:type="dxa"/>
+              <w:end w:w="100" w:type="dxa"/>
+            </w:tcMar>
+            <w:vAlign w:val="center"/>
+          </w:tcPr>
+          <w:p>
+            <w:pPr>
+              <w:spacing w:after="0" w:line="259" w:lineRule="auto"/>
+            </w:pPr>
+            <w:r>
+              <w:rPr>
+                <w:rFonts w:ascii="Calibri" w:hAnsi="Calibri" w:eastAsia="Microsoft YaHei"/>
+                <w:b w:val="0"/>
+                <w:color w:val="1F2937"/>
+                <w:sz w:val="15"/>
+              </w:rPr>
+              <w:t>返回基本资料、状态、version、fieldPermissions、allowedActions、关联计数和各信息组状态。</w:t>
+            </w:r>
+          </w:p>
+        </w:tc>
+      </w:tr>
+      <w:tr>
+        <w:trPr>
+          <w:cantSplit/>
+        </w:trPr>
+        <w:tc>
+          <w:tcPr>
+            <w:tcW w:type="dxa" w:w="1800"/>
+            <w:tcMar>
+              <w:top w:w="75" w:type="dxa"/>
+              <w:start w:w="100" w:type="dxa"/>
+              <w:bottom w:w="75" w:type="dxa"/>
+              <w:end w:w="100" w:type="dxa"/>
+            </w:tcMar>
+            <w:vAlign w:val="center"/>
+            <w:shd w:fill="F4F7FB"/>
+          </w:tcPr>
+          <w:p>
+            <w:pPr>
+              <w:spacing w:after="0" w:line="259" w:lineRule="auto"/>
+            </w:pPr>
+            <w:r>
+              <w:rPr>
+                <w:rFonts w:ascii="Calibri" w:hAnsi="Calibri" w:eastAsia="Microsoft YaHei"/>
+                <w:b w:val="0"/>
+                <w:color w:val="1F2937"/>
+                <w:sz w:val="15"/>
+              </w:rPr>
+              <w:t>状态时间线</w:t>
+            </w:r>
+          </w:p>
+        </w:tc>
+        <w:tc>
+          <w:tcPr>
+            <w:tcW w:type="dxa" w:w="3960"/>
+            <w:tcMar>
+              <w:top w:w="75" w:type="dxa"/>
+              <w:start w:w="100" w:type="dxa"/>
+              <w:bottom w:w="75" w:type="dxa"/>
+              <w:end w:w="100" w:type="dxa"/>
+            </w:tcMar>
+            <w:vAlign w:val="center"/>
+            <w:shd w:fill="F4F7FB"/>
+          </w:tcPr>
+          <w:p>
+            <w:pPr>
+              <w:spacing w:after="0" w:line="259" w:lineRule="auto"/>
+            </w:pPr>
+            <w:r>
+              <w:rPr>
+                <w:rFonts w:ascii="Calibri" w:hAnsi="Calibri" w:eastAsia="Microsoft YaHei"/>
+                <w:b w:val="0"/>
+                <w:color w:val="1F2937"/>
+                <w:sz w:val="15"/>
+              </w:rPr>
+              <w:t>GET /ops/v1/leads/{id}/timeline</w:t>
+            </w:r>
+          </w:p>
+        </w:tc>
+        <w:tc>
+          <w:tcPr>
+            <w:tcW w:type="dxa" w:w="4464"/>
+            <w:tcMar>
+              <w:top w:w="75" w:type="dxa"/>
+              <w:start w:w="100" w:type="dxa"/>
+              <w:bottom w:w="75" w:type="dxa"/>
+              <w:end w:w="100" w:type="dxa"/>
+            </w:tcMar>
+            <w:vAlign w:val="center"/>
+            <w:shd w:fill="F4F7FB"/>
+          </w:tcPr>
+          <w:p>
+            <w:pPr>
+              <w:spacing w:after="0" w:line="259" w:lineRule="auto"/>
+            </w:pPr>
+            <w:r>
+              <w:rPr>
+                <w:rFonts w:ascii="Calibri" w:hAnsi="Calibri" w:eastAsia="Microsoft YaHei"/>
+                <w:b w:val="0"/>
+                <w:color w:val="1F2937"/>
+                <w:sz w:val="15"/>
+              </w:rPr>
+              <w:t>按cursor分页返回不可覆盖的业务节点、操作者、来源端、业务时间和接收时间。</w:t>
+            </w:r>
+          </w:p>
+        </w:tc>
+      </w:tr>
+      <w:tr>
+        <w:trPr>
+          <w:cantSplit/>
+        </w:trPr>
+        <w:tc>
+          <w:tcPr>
+            <w:tcW w:type="dxa" w:w="1800"/>
+            <w:tcMar>
+              <w:top w:w="75" w:type="dxa"/>
+              <w:start w:w="100" w:type="dxa"/>
+              <w:bottom w:w="75" w:type="dxa"/>
+              <w:end w:w="100" w:type="dxa"/>
+            </w:tcMar>
+            <w:vAlign w:val="center"/>
+          </w:tcPr>
+          <w:p>
+            <w:pPr>
+              <w:spacing w:after="0" w:line="259" w:lineRule="auto"/>
+            </w:pPr>
+            <w:r>
+              <w:rPr>
+                <w:rFonts w:ascii="Calibri" w:hAnsi="Calibri" w:eastAsia="Microsoft YaHei"/>
+                <w:b w:val="0"/>
+                <w:color w:val="1F2937"/>
+                <w:sz w:val="15"/>
+              </w:rPr>
+              <w:t>关联对象</w:t>
+            </w:r>
+          </w:p>
+        </w:tc>
+        <w:tc>
+          <w:tcPr>
+            <w:tcW w:type="dxa" w:w="3960"/>
+            <w:tcMar>
+              <w:top w:w="75" w:type="dxa"/>
+              <w:start w:w="100" w:type="dxa"/>
+              <w:bottom w:w="75" w:type="dxa"/>
+              <w:end w:w="100" w:type="dxa"/>
+            </w:tcMar>
+            <w:vAlign w:val="center"/>
+          </w:tcPr>
+          <w:p>
+            <w:pPr>
+              <w:spacing w:after="0" w:line="259" w:lineRule="auto"/>
+            </w:pPr>
+            <w:r>
+              <w:rPr>
+                <w:rFonts w:ascii="Calibri" w:hAnsi="Calibri" w:eastAsia="Microsoft YaHei"/>
+                <w:b w:val="0"/>
+                <w:color w:val="1F2937"/>
+                <w:sz w:val="15"/>
+              </w:rPr>
+              <w:t>GET /ops/v1/leads/{id}/relations</w:t>
+            </w:r>
+          </w:p>
+        </w:tc>
+        <w:tc>
+          <w:tcPr>
+            <w:tcW w:type="dxa" w:w="4464"/>
+            <w:tcMar>
+              <w:top w:w="75" w:type="dxa"/>
+              <w:start w:w="100" w:type="dxa"/>
+              <w:bottom w:w="75" w:type="dxa"/>
+              <w:end w:w="100" w:type="dxa"/>
+            </w:tcMar>
+            <w:vAlign w:val="center"/>
+          </w:tcPr>
+          <w:p>
+            <w:pPr>
+              <w:spacing w:after="0" w:line="259" w:lineRule="auto"/>
+            </w:pPr>
+            <w:r>
+              <w:rPr>
+                <w:rFonts w:ascii="Calibri" w:hAnsi="Calibri" w:eastAsia="Microsoft YaHei"/>
+                <w:b w:val="0"/>
+                <w:color w:val="1F2937"/>
+                <w:sz w:val="15"/>
+              </w:rPr>
+              <w:t>按relationType分页查询，并执行目标对象数据范围和字段权限。</w:t>
+            </w:r>
+          </w:p>
+        </w:tc>
+      </w:tr>
+      <w:tr>
+        <w:trPr>
+          <w:cantSplit/>
+        </w:trPr>
+        <w:tc>
+          <w:tcPr>
+            <w:tcW w:type="dxa" w:w="1800"/>
+            <w:tcMar>
+              <w:top w:w="75" w:type="dxa"/>
+              <w:start w:w="100" w:type="dxa"/>
+              <w:bottom w:w="75" w:type="dxa"/>
+              <w:end w:w="100" w:type="dxa"/>
+            </w:tcMar>
+            <w:vAlign w:val="center"/>
+            <w:shd w:fill="F4F7FB"/>
+          </w:tcPr>
+          <w:p>
+            <w:pPr>
+              <w:spacing w:after="0" w:line="259" w:lineRule="auto"/>
+            </w:pPr>
+            <w:r>
+              <w:rPr>
+                <w:rFonts w:ascii="Calibri" w:hAnsi="Calibri" w:eastAsia="Microsoft YaHei"/>
+                <w:b w:val="0"/>
+                <w:color w:val="1F2937"/>
+                <w:sz w:val="15"/>
+              </w:rPr>
+              <w:t>操作记录</w:t>
+            </w:r>
+          </w:p>
+        </w:tc>
+        <w:tc>
+          <w:tcPr>
+            <w:tcW w:type="dxa" w:w="3960"/>
+            <w:tcMar>
+              <w:top w:w="75" w:type="dxa"/>
+              <w:start w:w="100" w:type="dxa"/>
+              <w:bottom w:w="75" w:type="dxa"/>
+              <w:end w:w="100" w:type="dxa"/>
+            </w:tcMar>
+            <w:vAlign w:val="center"/>
+            <w:shd w:fill="F4F7FB"/>
+          </w:tcPr>
+          <w:p>
+            <w:pPr>
+              <w:spacing w:after="0" w:line="259" w:lineRule="auto"/>
+            </w:pPr>
+            <w:r>
+              <w:rPr>
+                <w:rFonts w:ascii="Calibri" w:hAnsi="Calibri" w:eastAsia="Microsoft YaHei"/>
+                <w:b w:val="0"/>
+                <w:color w:val="1F2937"/>
+                <w:sz w:val="15"/>
+              </w:rPr>
+              <w:t>GET /ops/v1/leads/{id}/activities</w:t>
+            </w:r>
+          </w:p>
+        </w:tc>
+        <w:tc>
+          <w:tcPr>
+            <w:tcW w:type="dxa" w:w="4464"/>
+            <w:tcMar>
+              <w:top w:w="75" w:type="dxa"/>
+              <w:start w:w="100" w:type="dxa"/>
+              <w:bottom w:w="75" w:type="dxa"/>
+              <w:end w:w="100" w:type="dxa"/>
+            </w:tcMar>
+            <w:vAlign w:val="center"/>
+            <w:shd w:fill="F4F7FB"/>
+          </w:tcPr>
+          <w:p>
+            <w:pPr>
+              <w:spacing w:after="0" w:line="259" w:lineRule="auto"/>
+            </w:pPr>
+            <w:r>
+              <w:rPr>
+                <w:rFonts w:ascii="Calibri" w:hAnsi="Calibri" w:eastAsia="Microsoft YaHei"/>
+                <w:b w:val="0"/>
+                <w:color w:val="1F2937"/>
+                <w:sz w:val="15"/>
+              </w:rPr>
+              <w:t>返回字段变更摘要、状态动作、异步任务和权限可见的审计记录。</w:t>
+            </w:r>
+          </w:p>
+        </w:tc>
+      </w:tr>
+      <w:tr>
+        <w:trPr>
+          <w:cantSplit/>
+        </w:trPr>
+        <w:tc>
+          <w:tcPr>
+            <w:tcW w:type="dxa" w:w="1800"/>
+            <w:tcMar>
+              <w:top w:w="75" w:type="dxa"/>
+              <w:start w:w="100" w:type="dxa"/>
+              <w:bottom w:w="75" w:type="dxa"/>
+              <w:end w:w="100" w:type="dxa"/>
+            </w:tcMar>
+            <w:vAlign w:val="center"/>
+          </w:tcPr>
+          <w:p>
+            <w:pPr>
+              <w:spacing w:after="0" w:line="259" w:lineRule="auto"/>
+            </w:pPr>
+            <w:r>
+              <w:rPr>
+                <w:rFonts w:ascii="Calibri" w:hAnsi="Calibri" w:eastAsia="Microsoft YaHei"/>
+                <w:b w:val="0"/>
+                <w:color w:val="1F2937"/>
+                <w:sz w:val="15"/>
+              </w:rPr>
+              <w:t>执行业务动作</w:t>
+            </w:r>
+          </w:p>
+        </w:tc>
+        <w:tc>
+          <w:tcPr>
+            <w:tcW w:type="dxa" w:w="3960"/>
+            <w:tcMar>
+              <w:top w:w="75" w:type="dxa"/>
+              <w:start w:w="100" w:type="dxa"/>
+              <w:bottom w:w="75" w:type="dxa"/>
+              <w:end w:w="100" w:type="dxa"/>
+            </w:tcMar>
+            <w:vAlign w:val="center"/>
+          </w:tcPr>
+          <w:p>
+            <w:pPr>
+              <w:spacing w:after="0" w:line="259" w:lineRule="auto"/>
+            </w:pPr>
+            <w:r>
+              <w:rPr>
+                <w:rFonts w:ascii="Calibri" w:hAnsi="Calibri" w:eastAsia="Microsoft YaHei"/>
+                <w:b w:val="0"/>
+                <w:color w:val="1F2937"/>
+                <w:sz w:val="15"/>
+              </w:rPr>
+              <w:t>POST /ops/v1/leads/{id}/actions/{actionCode}</w:t>
+            </w:r>
+          </w:p>
+        </w:tc>
+        <w:tc>
+          <w:tcPr>
+            <w:tcW w:type="dxa" w:w="4464"/>
+            <w:tcMar>
+              <w:top w:w="75" w:type="dxa"/>
+              <w:start w:w="100" w:type="dxa"/>
+              <w:bottom w:w="75" w:type="dxa"/>
+              <w:end w:w="100" w:type="dxa"/>
+            </w:tcMar>
+            <w:vAlign w:val="center"/>
+          </w:tcPr>
+          <w:p>
+            <w:pPr>
+              <w:spacing w:after="0" w:line="259" w:lineRule="auto"/>
+            </w:pPr>
+            <w:r>
+              <w:rPr>
+                <w:rFonts w:ascii="Calibri" w:hAnsi="Calibri" w:eastAsia="Microsoft YaHei"/>
+                <w:b w:val="0"/>
+                <w:color w:val="1F2937"/>
+                <w:sz w:val="15"/>
+              </w:rPr>
+              <w:t>携带expectedVersion和clientRequestId；返回新version、状态、allowedActions及副作用任务。</w:t>
+            </w:r>
+          </w:p>
+        </w:tc>
+      </w:tr>
+      <w:tr>
+        <w:trPr>
+          <w:cantSplit/>
+        </w:trPr>
+        <w:tc>
+          <w:tcPr>
+            <w:tcW w:type="dxa" w:w="1800"/>
+            <w:tcMar>
+              <w:top w:w="75" w:type="dxa"/>
+              <w:start w:w="100" w:type="dxa"/>
+              <w:bottom w:w="75" w:type="dxa"/>
+              <w:end w:w="100" w:type="dxa"/>
+            </w:tcMar>
+            <w:vAlign w:val="center"/>
+            <w:shd w:fill="F4F7FB"/>
+          </w:tcPr>
+          <w:p>
+            <w:pPr>
+              <w:spacing w:after="0" w:line="259" w:lineRule="auto"/>
+            </w:pPr>
+            <w:r>
+              <w:rPr>
+                <w:rFonts w:ascii="Calibri" w:hAnsi="Calibri" w:eastAsia="Microsoft YaHei"/>
+                <w:b w:val="0"/>
+                <w:color w:val="1F2937"/>
+                <w:sz w:val="15"/>
+              </w:rPr>
+              <w:t>详情变更事件</w:t>
+            </w:r>
+          </w:p>
+        </w:tc>
+        <w:tc>
+          <w:tcPr>
+            <w:tcW w:type="dxa" w:w="3960"/>
+            <w:tcMar>
+              <w:top w:w="75" w:type="dxa"/>
+              <w:start w:w="100" w:type="dxa"/>
+              <w:bottom w:w="75" w:type="dxa"/>
+              <w:end w:w="100" w:type="dxa"/>
+            </w:tcMar>
+            <w:vAlign w:val="center"/>
+            <w:shd w:fill="F4F7FB"/>
+          </w:tcPr>
+          <w:p>
+            <w:pPr>
+              <w:spacing w:after="0" w:line="259" w:lineRule="auto"/>
+            </w:pPr>
+            <w:r>
+              <w:rPr>
+                <w:rFonts w:ascii="Calibri" w:hAnsi="Calibri" w:eastAsia="Microsoft YaHei"/>
+                <w:b w:val="0"/>
+                <w:color w:val="1F2937"/>
+                <w:sz w:val="15"/>
+              </w:rPr>
+              <w:t>线索池.DetailChanged.v1</w:t>
+            </w:r>
+          </w:p>
+        </w:tc>
+        <w:tc>
+          <w:tcPr>
+            <w:tcW w:type="dxa" w:w="4464"/>
+            <w:tcMar>
+              <w:top w:w="75" w:type="dxa"/>
+              <w:start w:w="100" w:type="dxa"/>
+              <w:bottom w:w="75" w:type="dxa"/>
+              <w:end w:w="100" w:type="dxa"/>
+            </w:tcMar>
+            <w:vAlign w:val="center"/>
+            <w:shd w:fill="F4F7FB"/>
+          </w:tcPr>
+          <w:p>
+            <w:pPr>
+              <w:spacing w:after="0" w:line="259" w:lineRule="auto"/>
+            </w:pPr>
+            <w:r>
+              <w:rPr>
+                <w:rFonts w:ascii="Calibri" w:hAnsi="Calibri" w:eastAsia="Microsoft YaHei"/>
+                <w:b w:val="0"/>
+                <w:color w:val="1F2937"/>
+                <w:sz w:val="15"/>
+              </w:rPr>
+              <w:t>包含eventId、aggregateId、version和changedSections；前端只刷新受影响信息组。</w:t>
+            </w:r>
+          </w:p>
+        </w:tc>
+      </w:tr>
+    </w:tbl>
+    <w:p>
+      <w:pPr>
+        <w:spacing w:after="0"/>
+      </w:pPr>
+    </w:p>
+    <w:p>
+      <w:pPr>
+        <w:pStyle w:val="Heading2"/>
+      </w:pPr>
+      <w:r>
+        <w:t>5.9 详情页异常边界与验收</w:t>
+      </w:r>
+    </w:p>
+    <w:tbl>
+      <w:tblPr>
+        <w:tblStyle w:val="TableGrid"/>
+        <w:tblW w:type="dxa" w:w="10224"/>
+        <w:jc w:val="center"/>
+        <w:tblLayout w:type="fixed"/>
+        <w:tblLook w:firstColumn="1" w:firstRow="1" w:lastColumn="0" w:lastRow="0" w:noHBand="0" w:noVBand="1" w:val="04A0"/>
+      </w:tblPr>
+      <w:tblGrid>
+        <w:gridCol w:w="1944"/>
+        <w:gridCol w:w="8280"/>
+      </w:tblGrid>
+      <w:tr>
+        <w:trPr>
+          <w:tblHeader/>
+        </w:trPr>
+        <w:tc>
+          <w:tcPr>
+            <w:tcW w:type="dxa" w:w="1944"/>
+            <w:shd w:fill="17365D"/>
+            <w:tcMar>
+              <w:top w:w="75" w:type="dxa"/>
+              <w:start w:w="100" w:type="dxa"/>
+              <w:bottom w:w="75" w:type="dxa"/>
+              <w:end w:w="100" w:type="dxa"/>
+            </w:tcMar>
+            <w:vAlign w:val="center"/>
+          </w:tcPr>
+          <w:p>
+            <w:r>
+              <w:rPr>
+                <w:rFonts w:ascii="Calibri" w:hAnsi="Calibri" w:eastAsia="Microsoft YaHei"/>
+                <w:b/>
+                <w:color w:val="FFFFFF"/>
+                <w:sz w:val="16"/>
+              </w:rPr>
+              <w:t>验收ID</w:t>
+            </w:r>
+          </w:p>
+        </w:tc>
+        <w:tc>
+          <w:tcPr>
+            <w:tcW w:type="dxa" w:w="8280"/>
+            <w:shd w:fill="17365D"/>
+            <w:tcMar>
+              <w:top w:w="75" w:type="dxa"/>
+              <w:start w:w="100" w:type="dxa"/>
+              <w:bottom w:w="75" w:type="dxa"/>
+              <w:end w:w="100" w:type="dxa"/>
+            </w:tcMar>
+            <w:vAlign w:val="center"/>
+          </w:tcPr>
+          <w:p>
+            <w:r>
+              <w:rPr>
+                <w:rFonts w:ascii="Calibri" w:hAnsi="Calibri" w:eastAsia="Microsoft YaHei"/>
+                <w:b/>
+                <w:color w:val="FFFFFF"/>
+                <w:sz w:val="16"/>
+              </w:rPr>
+              <w:t>验收条件</w:t>
+            </w:r>
+          </w:p>
+        </w:tc>
+      </w:tr>
+      <w:tr>
+        <w:trPr>
+          <w:cantSplit/>
+        </w:trPr>
+        <w:tc>
+          <w:tcPr>
+            <w:tcW w:type="dxa" w:w="1944"/>
+            <w:tcMar>
+              <w:top w:w="75" w:type="dxa"/>
+              <w:start w:w="100" w:type="dxa"/>
+              <w:bottom w:w="75" w:type="dxa"/>
+              <w:end w:w="100" w:type="dxa"/>
+            </w:tcMar>
+            <w:vAlign w:val="center"/>
+          </w:tcPr>
+          <w:p>
+            <w:pPr>
+              <w:spacing w:after="0" w:line="259" w:lineRule="auto"/>
+            </w:pPr>
+            <w:r>
+              <w:rPr>
+                <w:rFonts w:ascii="Calibri" w:hAnsi="Calibri" w:eastAsia="Microsoft YaHei"/>
+                <w:b w:val="0"/>
+                <w:color w:val="1F2937"/>
+                <w:sz w:val="16"/>
+              </w:rPr>
+              <w:t>OS-OPS-PRD-02-DAC01</w:t>
+            </w:r>
+          </w:p>
+        </w:tc>
+        <w:tc>
+          <w:tcPr>
+            <w:tcW w:type="dxa" w:w="8280"/>
+            <w:tcMar>
+              <w:top w:w="75" w:type="dxa"/>
+              <w:start w:w="100" w:type="dxa"/>
+              <w:bottom w:w="75" w:type="dxa"/>
+              <w:end w:w="100" w:type="dxa"/>
+            </w:tcMar>
+            <w:vAlign w:val="center"/>
+          </w:tcPr>
+          <w:p>
+            <w:pPr>
+              <w:spacing w:after="0" w:line="259" w:lineRule="auto"/>
+            </w:pPr>
+            <w:r>
+              <w:rPr>
+                <w:rFonts w:ascii="Calibri" w:hAnsi="Calibri" w:eastAsia="Microsoft YaHei"/>
+                <w:b w:val="0"/>
+                <w:color w:val="1F2937"/>
+                <w:sz w:val="16"/>
+              </w:rPr>
+              <w:t>从列表、业务编号或深链均能打开同一对象详情并在返回时保留列表上下文</w:t>
+            </w:r>
+          </w:p>
+        </w:tc>
+      </w:tr>
+      <w:tr>
+        <w:trPr>
+          <w:cantSplit/>
+        </w:trPr>
+        <w:tc>
+          <w:tcPr>
+            <w:tcW w:type="dxa" w:w="1944"/>
+            <w:tcMar>
+              <w:top w:w="75" w:type="dxa"/>
+              <w:start w:w="100" w:type="dxa"/>
+              <w:bottom w:w="75" w:type="dxa"/>
+              <w:end w:w="100" w:type="dxa"/>
+            </w:tcMar>
+            <w:vAlign w:val="center"/>
+            <w:shd w:fill="F4F7FB"/>
+          </w:tcPr>
+          <w:p>
+            <w:pPr>
+              <w:spacing w:after="0" w:line="259" w:lineRule="auto"/>
+            </w:pPr>
+            <w:r>
+              <w:rPr>
+                <w:rFonts w:ascii="Calibri" w:hAnsi="Calibri" w:eastAsia="Microsoft YaHei"/>
+                <w:b w:val="0"/>
+                <w:color w:val="1F2937"/>
+                <w:sz w:val="16"/>
+              </w:rPr>
+              <w:t>OS-OPS-PRD-02-DAC02</w:t>
+            </w:r>
+          </w:p>
+        </w:tc>
+        <w:tc>
+          <w:tcPr>
+            <w:tcW w:type="dxa" w:w="8280"/>
+            <w:tcMar>
+              <w:top w:w="75" w:type="dxa"/>
+              <w:start w:w="100" w:type="dxa"/>
+              <w:bottom w:w="75" w:type="dxa"/>
+              <w:end w:w="100" w:type="dxa"/>
+            </w:tcMar>
+            <w:vAlign w:val="center"/>
+            <w:shd w:fill="F4F7FB"/>
+          </w:tcPr>
+          <w:p>
+            <w:pPr>
+              <w:spacing w:after="0" w:line="259" w:lineRule="auto"/>
+            </w:pPr>
+            <w:r>
+              <w:rPr>
+                <w:rFonts w:ascii="Calibri" w:hAnsi="Calibri" w:eastAsia="Microsoft YaHei"/>
+                <w:b w:val="0"/>
+                <w:color w:val="1F2937"/>
+                <w:sz w:val="16"/>
+              </w:rPr>
+              <w:t>详情覆盖新增编辑字段、系统字段、状态、责任人、关联业务、附件和操作记录</w:t>
+            </w:r>
+          </w:p>
+        </w:tc>
+      </w:tr>
+      <w:tr>
+        <w:trPr>
+          <w:cantSplit/>
+        </w:trPr>
+        <w:tc>
+          <w:tcPr>
+            <w:tcW w:type="dxa" w:w="1944"/>
+            <w:tcMar>
+              <w:top w:w="75" w:type="dxa"/>
+              <w:start w:w="100" w:type="dxa"/>
+              <w:bottom w:w="75" w:type="dxa"/>
+              <w:end w:w="100" w:type="dxa"/>
+            </w:tcMar>
+            <w:vAlign w:val="center"/>
+          </w:tcPr>
+          <w:p>
+            <w:pPr>
+              <w:spacing w:after="0" w:line="259" w:lineRule="auto"/>
+            </w:pPr>
+            <w:r>
+              <w:rPr>
+                <w:rFonts w:ascii="Calibri" w:hAnsi="Calibri" w:eastAsia="Microsoft YaHei"/>
+                <w:b w:val="0"/>
+                <w:color w:val="1F2937"/>
+                <w:sz w:val="16"/>
+              </w:rPr>
+              <w:t>OS-OPS-PRD-02-DAC03</w:t>
+            </w:r>
+          </w:p>
+        </w:tc>
+        <w:tc>
+          <w:tcPr>
+            <w:tcW w:type="dxa" w:w="8280"/>
+            <w:tcMar>
+              <w:top w:w="75" w:type="dxa"/>
+              <w:start w:w="100" w:type="dxa"/>
+              <w:bottom w:w="75" w:type="dxa"/>
+              <w:end w:w="100" w:type="dxa"/>
+            </w:tcMar>
+            <w:vAlign w:val="center"/>
+          </w:tcPr>
+          <w:p>
+            <w:pPr>
+              <w:spacing w:after="0" w:line="259" w:lineRule="auto"/>
+            </w:pPr>
+            <w:r>
+              <w:rPr>
+                <w:rFonts w:ascii="Calibri" w:hAnsi="Calibri" w:eastAsia="Microsoft YaHei"/>
+                <w:b w:val="0"/>
+                <w:color w:val="1F2937"/>
+                <w:sz w:val="16"/>
+              </w:rPr>
+              <w:t>对象级和字段级权限在接口返回前生效，无权限内容不会先显示后遮盖</w:t>
+            </w:r>
+          </w:p>
+        </w:tc>
+      </w:tr>
+      <w:tr>
+        <w:trPr>
+          <w:cantSplit/>
+        </w:trPr>
+        <w:tc>
+          <w:tcPr>
+            <w:tcW w:type="dxa" w:w="1944"/>
+            <w:tcMar>
+              <w:top w:w="75" w:type="dxa"/>
+              <w:start w:w="100" w:type="dxa"/>
+              <w:bottom w:w="75" w:type="dxa"/>
+              <w:end w:w="100" w:type="dxa"/>
+            </w:tcMar>
+            <w:vAlign w:val="center"/>
+            <w:shd w:fill="F4F7FB"/>
+          </w:tcPr>
+          <w:p>
+            <w:pPr>
+              <w:spacing w:after="0" w:line="259" w:lineRule="auto"/>
+            </w:pPr>
+            <w:r>
+              <w:rPr>
+                <w:rFonts w:ascii="Calibri" w:hAnsi="Calibri" w:eastAsia="Microsoft YaHei"/>
+                <w:b w:val="0"/>
+                <w:color w:val="1F2937"/>
+                <w:sz w:val="16"/>
+              </w:rPr>
+              <w:t>OS-OPS-PRD-02-DAC04</w:t>
+            </w:r>
+          </w:p>
+        </w:tc>
+        <w:tc>
+          <w:tcPr>
+            <w:tcW w:type="dxa" w:w="8280"/>
+            <w:tcMar>
+              <w:top w:w="75" w:type="dxa"/>
+              <w:start w:w="100" w:type="dxa"/>
+              <w:bottom w:w="75" w:type="dxa"/>
+              <w:end w:w="100" w:type="dxa"/>
+            </w:tcMar>
+            <w:vAlign w:val="center"/>
+            <w:shd w:fill="F4F7FB"/>
+          </w:tcPr>
+          <w:p>
+            <w:pPr>
+              <w:spacing w:after="0" w:line="259" w:lineRule="auto"/>
+            </w:pPr>
+            <w:r>
+              <w:rPr>
+                <w:rFonts w:ascii="Calibri" w:hAnsi="Calibri" w:eastAsia="Microsoft YaHei"/>
+                <w:b w:val="0"/>
+                <w:color w:val="1F2937"/>
+                <w:sz w:val="16"/>
+              </w:rPr>
+              <w:t>当前状态、时间线、操作记录和allowedActions使用同一id与version且可以相互解释</w:t>
+            </w:r>
+          </w:p>
+        </w:tc>
+      </w:tr>
+      <w:tr>
+        <w:trPr>
+          <w:cantSplit/>
+        </w:trPr>
+        <w:tc>
+          <w:tcPr>
+            <w:tcW w:type="dxa" w:w="1944"/>
+            <w:tcMar>
+              <w:top w:w="75" w:type="dxa"/>
+              <w:start w:w="100" w:type="dxa"/>
+              <w:bottom w:w="75" w:type="dxa"/>
+              <w:end w:w="100" w:type="dxa"/>
+            </w:tcMar>
+            <w:vAlign w:val="center"/>
+          </w:tcPr>
+          <w:p>
+            <w:pPr>
+              <w:spacing w:after="0" w:line="259" w:lineRule="auto"/>
+            </w:pPr>
+            <w:r>
+              <w:rPr>
+                <w:rFonts w:ascii="Calibri" w:hAnsi="Calibri" w:eastAsia="Microsoft YaHei"/>
+                <w:b w:val="0"/>
+                <w:color w:val="1F2937"/>
+                <w:sz w:val="16"/>
+              </w:rPr>
+              <w:t>OS-OPS-PRD-02-DAC05</w:t>
+            </w:r>
+          </w:p>
+        </w:tc>
+        <w:tc>
+          <w:tcPr>
+            <w:tcW w:type="dxa" w:w="8280"/>
+            <w:tcMar>
+              <w:top w:w="75" w:type="dxa"/>
+              <w:start w:w="100" w:type="dxa"/>
+              <w:bottom w:w="75" w:type="dxa"/>
+              <w:end w:w="100" w:type="dxa"/>
+            </w:tcMar>
+            <w:vAlign w:val="center"/>
+          </w:tcPr>
+          <w:p>
+            <w:pPr>
+              <w:spacing w:after="0" w:line="259" w:lineRule="auto"/>
+            </w:pPr>
+            <w:r>
+              <w:rPr>
+                <w:rFonts w:ascii="Calibri" w:hAnsi="Calibri" w:eastAsia="Microsoft YaHei"/>
+                <w:b w:val="0"/>
+                <w:color w:val="1F2937"/>
+                <w:sz w:val="16"/>
+              </w:rPr>
+              <w:t>每个动作同时校验角色、dataScope、状态、expectedVersion和业务前置</w:t>
+            </w:r>
+          </w:p>
+        </w:tc>
+      </w:tr>
+      <w:tr>
+        <w:trPr>
+          <w:cantSplit/>
+        </w:trPr>
+        <w:tc>
+          <w:tcPr>
+            <w:tcW w:type="dxa" w:w="1944"/>
+            <w:tcMar>
+              <w:top w:w="75" w:type="dxa"/>
+              <w:start w:w="100" w:type="dxa"/>
+              <w:bottom w:w="75" w:type="dxa"/>
+              <w:end w:w="100" w:type="dxa"/>
+            </w:tcMar>
+            <w:vAlign w:val="center"/>
+            <w:shd w:fill="F4F7FB"/>
+          </w:tcPr>
+          <w:p>
+            <w:pPr>
+              <w:spacing w:after="0" w:line="259" w:lineRule="auto"/>
+            </w:pPr>
+            <w:r>
+              <w:rPr>
+                <w:rFonts w:ascii="Calibri" w:hAnsi="Calibri" w:eastAsia="Microsoft YaHei"/>
+                <w:b w:val="0"/>
+                <w:color w:val="1F2937"/>
+                <w:sz w:val="16"/>
+              </w:rPr>
+              <w:t>OS-OPS-PRD-02-DAC06</w:t>
+            </w:r>
+          </w:p>
+        </w:tc>
+        <w:tc>
+          <w:tcPr>
+            <w:tcW w:type="dxa" w:w="8280"/>
+            <w:tcMar>
+              <w:top w:w="75" w:type="dxa"/>
+              <w:start w:w="100" w:type="dxa"/>
+              <w:bottom w:w="75" w:type="dxa"/>
+              <w:end w:w="100" w:type="dxa"/>
+            </w:tcMar>
+            <w:vAlign w:val="center"/>
+            <w:shd w:fill="F4F7FB"/>
+          </w:tcPr>
+          <w:p>
+            <w:pPr>
+              <w:spacing w:after="0" w:line="259" w:lineRule="auto"/>
+            </w:pPr>
+            <w:r>
+              <w:rPr>
+                <w:rFonts w:ascii="Calibri" w:hAnsi="Calibri" w:eastAsia="Microsoft YaHei"/>
+                <w:b w:val="0"/>
+                <w:color w:val="1F2937"/>
+                <w:sz w:val="16"/>
+              </w:rPr>
+              <w:t>关联对象数量、列表和跳转目标一致，目标对象无权时不泄露敏感摘要</w:t>
+            </w:r>
+          </w:p>
+        </w:tc>
+      </w:tr>
+      <w:tr>
+        <w:trPr>
+          <w:cantSplit/>
+        </w:trPr>
+        <w:tc>
+          <w:tcPr>
+            <w:tcW w:type="dxa" w:w="1944"/>
+            <w:tcMar>
+              <w:top w:w="75" w:type="dxa"/>
+              <w:start w:w="100" w:type="dxa"/>
+              <w:bottom w:w="75" w:type="dxa"/>
+              <w:end w:w="100" w:type="dxa"/>
+            </w:tcMar>
+            <w:vAlign w:val="center"/>
+          </w:tcPr>
+          <w:p>
+            <w:pPr>
+              <w:spacing w:after="0" w:line="259" w:lineRule="auto"/>
+            </w:pPr>
+            <w:r>
+              <w:rPr>
+                <w:rFonts w:ascii="Calibri" w:hAnsi="Calibri" w:eastAsia="Microsoft YaHei"/>
+                <w:b w:val="0"/>
+                <w:color w:val="1F2937"/>
+                <w:sz w:val="16"/>
+              </w:rPr>
+              <w:t>OS-OPS-PRD-02-DAC07</w:t>
+            </w:r>
+          </w:p>
+        </w:tc>
+        <w:tc>
+          <w:tcPr>
+            <w:tcW w:type="dxa" w:w="8280"/>
+            <w:tcMar>
+              <w:top w:w="75" w:type="dxa"/>
+              <w:start w:w="100" w:type="dxa"/>
+              <w:bottom w:w="75" w:type="dxa"/>
+              <w:end w:w="100" w:type="dxa"/>
+            </w:tcMar>
+            <w:vAlign w:val="center"/>
+          </w:tcPr>
+          <w:p>
+            <w:pPr>
+              <w:spacing w:after="0" w:line="259" w:lineRule="auto"/>
+            </w:pPr>
+            <w:r>
+              <w:rPr>
+                <w:rFonts w:ascii="Calibri" w:hAnsi="Calibri" w:eastAsia="Microsoft YaHei"/>
+                <w:b w:val="0"/>
+                <w:color w:val="1F2937"/>
+                <w:sz w:val="16"/>
+              </w:rPr>
+              <w:t>附件预览下载校验扫描状态和权限并形成审计</w:t>
+            </w:r>
+          </w:p>
+        </w:tc>
+      </w:tr>
+      <w:tr>
+        <w:trPr>
+          <w:cantSplit/>
+        </w:trPr>
+        <w:tc>
+          <w:tcPr>
+            <w:tcW w:type="dxa" w:w="1944"/>
+            <w:tcMar>
+              <w:top w:w="75" w:type="dxa"/>
+              <w:start w:w="100" w:type="dxa"/>
+              <w:bottom w:w="75" w:type="dxa"/>
+              <w:end w:w="100" w:type="dxa"/>
+            </w:tcMar>
+            <w:vAlign w:val="center"/>
+            <w:shd w:fill="F4F7FB"/>
+          </w:tcPr>
+          <w:p>
+            <w:pPr>
+              <w:spacing w:after="0" w:line="259" w:lineRule="auto"/>
+            </w:pPr>
+            <w:r>
+              <w:rPr>
+                <w:rFonts w:ascii="Calibri" w:hAnsi="Calibri" w:eastAsia="Microsoft YaHei"/>
+                <w:b w:val="0"/>
+                <w:color w:val="1F2937"/>
+                <w:sz w:val="16"/>
+              </w:rPr>
+              <w:t>OS-OPS-PRD-02-DAC08</w:t>
+            </w:r>
+          </w:p>
+        </w:tc>
+        <w:tc>
+          <w:tcPr>
+            <w:tcW w:type="dxa" w:w="8280"/>
+            <w:tcMar>
+              <w:top w:w="75" w:type="dxa"/>
+              <w:start w:w="100" w:type="dxa"/>
+              <w:bottom w:w="75" w:type="dxa"/>
+              <w:end w:w="100" w:type="dxa"/>
+            </w:tcMar>
+            <w:vAlign w:val="center"/>
+            <w:shd w:fill="F4F7FB"/>
+          </w:tcPr>
+          <w:p>
+            <w:pPr>
+              <w:spacing w:after="0" w:line="259" w:lineRule="auto"/>
+            </w:pPr>
+            <w:r>
+              <w:rPr>
+                <w:rFonts w:ascii="Calibri" w:hAnsi="Calibri" w:eastAsia="Microsoft YaHei"/>
+                <w:b w:val="0"/>
+                <w:color w:val="1F2937"/>
+                <w:sz w:val="16"/>
+              </w:rPr>
+              <w:t>409并发冲突保留未提交输入并提示最新版本，重复clientRequestId不产生重复副作用</w:t>
+            </w:r>
+          </w:p>
+        </w:tc>
+      </w:tr>
+      <w:tr>
+        <w:trPr>
+          <w:cantSplit/>
+        </w:trPr>
+        <w:tc>
+          <w:tcPr>
+            <w:tcW w:type="dxa" w:w="1944"/>
+            <w:tcMar>
+              <w:top w:w="75" w:type="dxa"/>
+              <w:start w:w="100" w:type="dxa"/>
+              <w:bottom w:w="75" w:type="dxa"/>
+              <w:end w:w="100" w:type="dxa"/>
+            </w:tcMar>
+            <w:vAlign w:val="center"/>
+          </w:tcPr>
+          <w:p>
+            <w:pPr>
+              <w:spacing w:after="0" w:line="259" w:lineRule="auto"/>
+            </w:pPr>
+            <w:r>
+              <w:rPr>
+                <w:rFonts w:ascii="Calibri" w:hAnsi="Calibri" w:eastAsia="Microsoft YaHei"/>
+                <w:b w:val="0"/>
+                <w:color w:val="1F2937"/>
+                <w:sz w:val="16"/>
+              </w:rPr>
+              <w:t>OS-OPS-PRD-02-DAC09</w:t>
+            </w:r>
+          </w:p>
+        </w:tc>
+        <w:tc>
+          <w:tcPr>
+            <w:tcW w:type="dxa" w:w="8280"/>
+            <w:tcMar>
+              <w:top w:w="75" w:type="dxa"/>
+              <w:start w:w="100" w:type="dxa"/>
+              <w:bottom w:w="75" w:type="dxa"/>
+              <w:end w:w="100" w:type="dxa"/>
+            </w:tcMar>
+            <w:vAlign w:val="center"/>
+          </w:tcPr>
+          <w:p>
+            <w:pPr>
+              <w:spacing w:after="0" w:line="259" w:lineRule="auto"/>
+            </w:pPr>
+            <w:r>
+              <w:rPr>
+                <w:rFonts w:ascii="Calibri" w:hAnsi="Calibri" w:eastAsia="Microsoft YaHei"/>
+                <w:b w:val="0"/>
+                <w:color w:val="1F2937"/>
+                <w:sz w:val="16"/>
+              </w:rPr>
+              <w:t>异步失败、第三方失败和部分成功均显示任务编号、错误与补偿入口</w:t>
+            </w:r>
+          </w:p>
+        </w:tc>
+      </w:tr>
+      <w:tr>
+        <w:trPr>
+          <w:cantSplit/>
+        </w:trPr>
+        <w:tc>
+          <w:tcPr>
+            <w:tcW w:type="dxa" w:w="1944"/>
+            <w:tcMar>
+              <w:top w:w="75" w:type="dxa"/>
+              <w:start w:w="100" w:type="dxa"/>
+              <w:bottom w:w="75" w:type="dxa"/>
+              <w:end w:w="100" w:type="dxa"/>
+            </w:tcMar>
+            <w:vAlign w:val="center"/>
+            <w:shd w:fill="F4F7FB"/>
+          </w:tcPr>
+          <w:p>
+            <w:pPr>
+              <w:spacing w:after="0" w:line="259" w:lineRule="auto"/>
+            </w:pPr>
+            <w:r>
+              <w:rPr>
+                <w:rFonts w:ascii="Calibri" w:hAnsi="Calibri" w:eastAsia="Microsoft YaHei"/>
+                <w:b w:val="0"/>
+                <w:color w:val="1F2937"/>
+                <w:sz w:val="16"/>
+              </w:rPr>
+              <w:t>OS-OPS-PRD-02-DAC10</w:t>
+            </w:r>
+          </w:p>
+        </w:tc>
+        <w:tc>
+          <w:tcPr>
+            <w:tcW w:type="dxa" w:w="8280"/>
+            <w:tcMar>
+              <w:top w:w="75" w:type="dxa"/>
+              <w:start w:w="100" w:type="dxa"/>
+              <w:bottom w:w="75" w:type="dxa"/>
+              <w:end w:w="100" w:type="dxa"/>
+            </w:tcMar>
+            <w:vAlign w:val="center"/>
+            <w:shd w:fill="F4F7FB"/>
+          </w:tcPr>
+          <w:p>
+            <w:pPr>
+              <w:spacing w:after="0" w:line="259" w:lineRule="auto"/>
+            </w:pPr>
+            <w:r>
+              <w:rPr>
+                <w:rFonts w:ascii="Calibri" w:hAnsi="Calibri" w:eastAsia="Microsoft YaHei"/>
+                <w:b w:val="0"/>
+                <w:color w:val="1F2937"/>
+                <w:sz w:val="16"/>
+              </w:rPr>
+              <w:t>详情变更事件只刷新changedSections，重新查询后各页签数据与主域一致</w:t>
+            </w:r>
+          </w:p>
+        </w:tc>
+      </w:tr>
+    </w:tbl>
+    <w:p>
+      <w:pPr>
+        <w:spacing w:after="0"/>
+      </w:pPr>
     </w:p>
     <w:p>
       <w:pPr>
@@ -19214,7 +23902,7 @@
         <w:color w:val="667085"/>
         <w:sz w:val="15"/>
       </w:rPr>
-      <w:t xml:space="preserve">V2.3  |  2026-09-09  |  </w:t>
+      <w:t xml:space="preserve">V2.5  |  2026-09-09  |  </w:t>
     </w:r>
     <w:r>
       <w:fldChar w:fldCharType="begin"/>
@@ -19960,9 +24648,6 @@
     <w:rsid w:val="00FC693F"/>
     <w:pPr>
       <w:keepNext/>
-      <w:pBdr>
-        <w:bottom w:val="single" w:sz="8" w:space="4" w:color="4F81BD" w:themeColor="accent1"/>
-      </w:pBdr>
       <w:spacing w:after="200" w:line="240" w:lineRule="auto" w:before="0"/>
       <w:contextualSpacing/>
     </w:pPr>

</xml_diff>